<commit_message>
removed printed testing in pumptest
and added more justification
</commit_message>
<xml_diff>
--- a/Justification.docx
+++ b/Justification.docx
@@ -52,157 +52,124 @@
       </w:pPr>
       <w:r>
         <w:rPr>
-          <w:lang w:val="en-US"/>
-        </w:rPr>
-        <w:t>Originally, WeatherManager performs too many tasks:</w:t>
-      </w:r>
-    </w:p>
-    <w:p>
-      <w:pPr>
-        <w:pStyle w:val="ListParagraph"/>
-        <w:numPr>
-          <w:ilvl w:val="0"/>
-          <w:numId w:val="4"/>
-        </w:numPr>
-        <w:rPr>
-          <w:lang w:val="en-US"/>
-        </w:rPr>
-      </w:pPr>
-      <w:r>
-        <w:rPr>
-          <w:lang w:val="en-US"/>
-        </w:rPr>
-        <w:t>Queries isDamaging, isObscuring</w:t>
-      </w:r>
-    </w:p>
-    <w:p>
-      <w:pPr>
-        <w:pStyle w:val="ListParagraph"/>
-        <w:numPr>
-          <w:ilvl w:val="0"/>
-          <w:numId w:val="4"/>
-        </w:numPr>
-        <w:rPr>
-          <w:lang w:val="en-US"/>
-        </w:rPr>
-      </w:pPr>
-      <w:r>
-        <w:rPr>
-          <w:lang w:val="en-US"/>
-        </w:rPr>
-        <w:t xml:space="preserve">Applies lightningRod to adjust the radius susceptible </w:t>
-      </w:r>
-      <w:r>
-        <w:rPr>
-          <w:lang w:val="en-US"/>
-        </w:rPr>
-        <w:t>to</w:t>
-      </w:r>
-      <w:r>
-        <w:rPr>
-          <w:lang w:val="en-US"/>
-        </w:rPr>
-        <w:t xml:space="preserve"> lightning</w:t>
-      </w:r>
-    </w:p>
-    <w:p>
-      <w:pPr>
-        <w:pStyle w:val="ListParagraph"/>
-        <w:numPr>
-          <w:ilvl w:val="0"/>
-          <w:numId w:val="4"/>
-        </w:numPr>
-        <w:rPr>
-          <w:lang w:val="en-US"/>
-        </w:rPr>
-      </w:pPr>
-      <w:r>
-        <w:rPr>
-          <w:lang w:val="en-US"/>
-        </w:rPr>
-        <w:t>Adds weather spawn points (for clouds and lightning)</w:t>
-      </w:r>
-    </w:p>
-    <w:p>
-      <w:pPr>
-        <w:rPr>
-          <w:lang w:val="en-US"/>
-        </w:rPr>
-      </w:pPr>
-      <w:r>
-        <w:rPr>
-          <w:lang w:val="en-US"/>
-        </w:rPr>
-        <w:t>Consequently, it is decided that WeatherManager be split into three corresponding classes:</w:t>
-      </w:r>
-    </w:p>
-    <w:p>
-      <w:pPr>
-        <w:rPr>
-          <w:lang w:val="en-US"/>
-        </w:rPr>
-      </w:pPr>
-      <w:r>
-        <w:rPr>
-          <w:lang w:val="en-US"/>
-        </w:rPr>
-        <w:t>--</w:t>
-      </w:r>
-    </w:p>
-    <w:p>
-      <w:pPr>
-        <w:rPr>
-          <w:lang w:val="en-US"/>
-        </w:rPr>
-      </w:pPr>
-      <w:r>
-        <w:rPr>
-          <w:b/>
-          <w:bCs/>
-          <w:lang w:val="en-US"/>
-        </w:rPr>
-        <w:t>Defensive programming</w:t>
-      </w:r>
-      <w:r>
-        <w:rPr>
-          <w:lang w:val="en-US"/>
-        </w:rPr>
-        <w:t xml:space="preserve">: instead of adding it to a final array list, </w:t>
-      </w:r>
-    </w:p>
-    <w:p>
-      <w:r>
-        <w:t xml:space="preserve">return </w:t>
-      </w:r>
-      <w:r>
-        <w:t>new</w:t>
-      </w:r>
-      <w:r>
-        <w:t xml:space="preserve"> ArrayList&lt;&gt;(phenomena);</w:t>
-      </w:r>
-    </w:p>
-    <w:p>
-      <w:pPr>
-        <w:rPr>
-          <w:lang w:val="en-US"/>
-        </w:rPr>
-      </w:pPr>
-    </w:p>
-    <w:p>
-      <w:pPr>
-        <w:rPr>
-          <w:lang w:val="en-US"/>
-        </w:rPr>
-      </w:pPr>
+          <w:noProof/>
+          <w:lang w:val="en-US"/>
+        </w:rPr>
+        <mc:AlternateContent>
+          <mc:Choice Requires="wps">
+            <w:drawing>
+              <wp:anchor distT="45720" distB="45720" distL="114300" distR="114300" simplePos="0" relativeHeight="251666432" behindDoc="0" locked="0" layoutInCell="1" allowOverlap="1" wp14:anchorId="10BB48D2" wp14:editId="064867CE">
+                <wp:simplePos x="0" y="0"/>
+                <wp:positionH relativeFrom="column">
+                  <wp:posOffset>3834130</wp:posOffset>
+                </wp:positionH>
+                <wp:positionV relativeFrom="paragraph">
+                  <wp:posOffset>112395</wp:posOffset>
+                </wp:positionV>
+                <wp:extent cx="2360930" cy="1404620"/>
+                <wp:effectExtent l="0" t="0" r="22860" b="11430"/>
+                <wp:wrapSquare wrapText="bothSides"/>
+                <wp:docPr id="17032777" name="Text Box 2"/>
+                <wp:cNvGraphicFramePr>
+                  <a:graphicFrameLocks xmlns:a="http://schemas.openxmlformats.org/drawingml/2006/main"/>
+                </wp:cNvGraphicFramePr>
+                <a:graphic xmlns:a="http://schemas.openxmlformats.org/drawingml/2006/main">
+                  <a:graphicData uri="http://schemas.microsoft.com/office/word/2010/wordprocessingShape">
+                    <wps:wsp>
+                      <wps:cNvSpPr txBox="1">
+                        <a:spLocks noChangeArrowheads="1"/>
+                      </wps:cNvSpPr>
+                      <wps:spPr bwMode="auto">
+                        <a:xfrm>
+                          <a:off x="0" y="0"/>
+                          <a:ext cx="2360930" cy="1404620"/>
+                        </a:xfrm>
+                        <a:prstGeom prst="rect">
+                          <a:avLst/>
+                        </a:prstGeom>
+                        <a:solidFill>
+                          <a:srgbClr val="FFFFFF"/>
+                        </a:solidFill>
+                        <a:ln w="9525">
+                          <a:solidFill>
+                            <a:srgbClr val="000000"/>
+                          </a:solidFill>
+                          <a:miter lim="800000"/>
+                          <a:headEnd/>
+                          <a:tailEnd/>
+                        </a:ln>
+                      </wps:spPr>
+                      <wps:txbx>
+                        <w:txbxContent>
+                          <w:p>
+                            <w:pPr>
+                              <w:rPr>
+                                <w:lang w:val="en-US"/>
+                              </w:rPr>
+                            </w:pPr>
+                            <w:r>
+                              <w:rPr>
+                                <w:lang w:val="en-US"/>
+                              </w:rPr>
+                              <w:t>Low cohesion in WeatherManager since it has too many responsibilities</w:t>
+                            </w:r>
+                          </w:p>
+                        </w:txbxContent>
+                      </wps:txbx>
+                      <wps:bodyPr rot="0" vert="horz" wrap="square" lIns="91440" tIns="45720" rIns="91440" bIns="45720" anchor="t" anchorCtr="0">
+                        <a:spAutoFit/>
+                      </wps:bodyPr>
+                    </wps:wsp>
+                  </a:graphicData>
+                </a:graphic>
+                <wp14:sizeRelH relativeFrom="margin">
+                  <wp14:pctWidth>40000</wp14:pctWidth>
+                </wp14:sizeRelH>
+                <wp14:sizeRelV relativeFrom="margin">
+                  <wp14:pctHeight>20000</wp14:pctHeight>
+                </wp14:sizeRelV>
+              </wp:anchor>
+            </w:drawing>
+          </mc:Choice>
+          <mc:Fallback>
+            <w:pict>
+              <v:shapetype w14:anchorId="10BB48D2" id="_x0000_t202" coordsize="21600,21600" o:spt="202" path="m,l,21600r21600,l21600,xe">
+                <v:stroke joinstyle="miter"/>
+                <v:path gradientshapeok="t" o:connecttype="rect"/>
+              </v:shapetype>
+              <v:shape id="Text Box 2" o:spid="_x0000_s1026" type="#_x0000_t202" style="position:absolute;margin-left:301.9pt;margin-top:8.85pt;width:185.9pt;height:110.6pt;z-index:251666432;visibility:visible;mso-wrap-style:square;mso-width-percent:400;mso-height-percent:200;mso-wrap-distance-left:9pt;mso-wrap-distance-top:3.6pt;mso-wrap-distance-right:9pt;mso-wrap-distance-bottom:3.6pt;mso-position-horizontal:absolute;mso-position-horizontal-relative:text;mso-position-vertical:absolute;mso-position-vertical-relative:text;mso-width-percent:400;mso-height-percent:200;mso-width-relative:margin;mso-height-relative:margin;v-text-anchor:top" o:gfxdata="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">
+                <v:textbox style="mso-fit-shape-to-text:t">
+                  <w:txbxContent>
+                    <w:p>
+                      <w:pPr>
+                        <w:rPr>
+                          <w:lang w:val="en-US"/>
+                        </w:rPr>
+                      </w:pPr>
+                      <w:r>
+                        <w:rPr>
+                          <w:lang w:val="en-US"/>
+                        </w:rPr>
+                        <w:t>Low cohesion in WeatherManager since it has too many responsibilities</w:t>
+                      </w:r>
+                    </w:p>
+                  </w:txbxContent>
+                </v:textbox>
+                <w10:wrap type="square"/>
+              </v:shape>
+            </w:pict>
+          </mc:Fallback>
+        </mc:AlternateContent>
+      </w:r>
       <w:r>
         <w:rPr>
           <w:lang w:val="en-US"/>
         </w:rPr>
         <w:drawing>
-          <wp:inline distT="0" distB="0" distL="0" distR="0" wp14:anchorId="60E2E91C" wp14:editId="5DCBD87F">
-            <wp:extent cx="5731510" cy="2249170"/>
-            <wp:effectExtent l="0" t="0" r="2540" b="0"/>
-            <wp:docPr id="515675042" name="Picture 1"/>
+          <wp:inline distT="0" distB="0" distL="0" distR="0" wp14:anchorId="754434DA" wp14:editId="1AA88534">
+            <wp:extent cx="3657600" cy="1248323"/>
+            <wp:effectExtent l="0" t="0" r="0" b="9525"/>
+            <wp:docPr id="1866748019" name="Picture 1"/>
             <wp:cNvGraphicFramePr>
               <a:graphicFrameLocks xmlns:a="http://schemas.openxmlformats.org/drawingml/2006/main" noChangeAspect="1"/>
             </wp:cNvGraphicFramePr>
@@ -210,7 +177,7 @@
               <a:graphicData uri="http://schemas.openxmlformats.org/drawingml/2006/picture">
                 <pic:pic xmlns:pic="http://schemas.openxmlformats.org/drawingml/2006/picture">
                   <pic:nvPicPr>
-                    <pic:cNvPr id="515675042" name=""/>
+                    <pic:cNvPr id="1866748019" name=""/>
                     <pic:cNvPicPr/>
                   </pic:nvPicPr>
                   <pic:blipFill>
@@ -222,7 +189,7 @@
                   <pic:spPr>
                     <a:xfrm>
                       <a:off x="0" y="0"/>
-                      <a:ext cx="5731510" cy="2249170"/>
+                      <a:ext cx="3673174" cy="1253638"/>
                     </a:xfrm>
                     <a:prstGeom prst="rect">
                       <a:avLst/>
@@ -233,6 +200,243 @@
             </a:graphic>
           </wp:inline>
         </w:drawing>
+      </w:r>
+    </w:p>
+    <w:p>
+      <w:pPr>
+        <w:rPr>
+          <w:lang w:val="en-US"/>
+        </w:rPr>
+      </w:pPr>
+      <w:r>
+        <w:rPr>
+          <w:lang w:val="en-US"/>
+        </w:rPr>
+        <w:t>Originally, WeatherManager performs too many tasks</w:t>
+      </w:r>
+      <w:r>
+        <w:rPr>
+          <w:lang w:val="en-US"/>
+        </w:rPr>
+        <w:t xml:space="preserve"> (hence </w:t>
+      </w:r>
+      <w:r>
+        <w:rPr>
+          <w:b/>
+          <w:bCs/>
+          <w:lang w:val="en-US"/>
+        </w:rPr>
+        <w:t>low cohesion)</w:t>
+      </w:r>
+      <w:r>
+        <w:rPr>
+          <w:lang w:val="en-US"/>
+        </w:rPr>
+        <w:t>:</w:t>
+      </w:r>
+    </w:p>
+    <w:p>
+      <w:pPr>
+        <w:pStyle w:val="ListParagraph"/>
+        <w:numPr>
+          <w:ilvl w:val="0"/>
+          <w:numId w:val="4"/>
+        </w:numPr>
+        <w:rPr>
+          <w:lang w:val="en-US"/>
+        </w:rPr>
+      </w:pPr>
+      <w:r>
+        <w:rPr>
+          <w:lang w:val="en-US"/>
+        </w:rPr>
+        <w:t>Answers queries on</w:t>
+      </w:r>
+      <w:r>
+        <w:rPr>
+          <w:lang w:val="en-US"/>
+        </w:rPr>
+        <w:t xml:space="preserve"> isDamaging, isObscuring</w:t>
+      </w:r>
+    </w:p>
+    <w:p>
+      <w:pPr>
+        <w:pStyle w:val="ListParagraph"/>
+        <w:numPr>
+          <w:ilvl w:val="0"/>
+          <w:numId w:val="4"/>
+        </w:numPr>
+        <w:rPr>
+          <w:lang w:val="en-US"/>
+        </w:rPr>
+      </w:pPr>
+      <w:r>
+        <w:rPr>
+          <w:lang w:val="en-US"/>
+        </w:rPr>
+        <w:t xml:space="preserve">Applies lightningRod </w:t>
+      </w:r>
+      <w:r>
+        <w:rPr>
+          <w:lang w:val="en-US"/>
+        </w:rPr>
+        <w:t xml:space="preserve">attraction + calculates </w:t>
+      </w:r>
+      <w:r>
+        <w:rPr>
+          <w:lang w:val="en-US"/>
+        </w:rPr>
+        <w:t xml:space="preserve">the radius susceptible </w:t>
+      </w:r>
+      <w:r>
+        <w:rPr>
+          <w:lang w:val="en-US"/>
+        </w:rPr>
+        <w:t>to</w:t>
+      </w:r>
+      <w:r>
+        <w:rPr>
+          <w:lang w:val="en-US"/>
+        </w:rPr>
+        <w:t xml:space="preserve"> lightning</w:t>
+      </w:r>
+    </w:p>
+    <w:p>
+      <w:pPr>
+        <w:pStyle w:val="ListParagraph"/>
+        <w:numPr>
+          <w:ilvl w:val="0"/>
+          <w:numId w:val="4"/>
+        </w:numPr>
+        <w:rPr>
+          <w:lang w:val="en-US"/>
+        </w:rPr>
+      </w:pPr>
+      <w:r>
+        <w:rPr>
+          <w:lang w:val="en-US"/>
+        </w:rPr>
+        <w:t>Adds weather spawn points (for clouds and lightning)</w:t>
+      </w:r>
+    </w:p>
+    <w:p>
+      <w:pPr>
+        <w:pStyle w:val="ListParagraph"/>
+        <w:numPr>
+          <w:ilvl w:val="0"/>
+          <w:numId w:val="4"/>
+        </w:numPr>
+        <w:rPr>
+          <w:lang w:val="en-US"/>
+        </w:rPr>
+      </w:pPr>
+      <w:r>
+        <w:rPr>
+          <w:lang w:val="en-US"/>
+        </w:rPr>
+        <w:t>Ticks all weather</w:t>
+      </w:r>
+    </w:p>
+    <w:p>
+      <w:pPr>
+        <w:pStyle w:val="ListParagraph"/>
+        <w:numPr>
+          <w:ilvl w:val="0"/>
+          <w:numId w:val="4"/>
+        </w:numPr>
+        <w:rPr>
+          <w:lang w:val="en-US"/>
+        </w:rPr>
+      </w:pPr>
+      <w:r>
+        <w:rPr>
+          <w:lang w:val="en-US"/>
+        </w:rPr>
+        <w:t>Renders all weather</w:t>
+      </w:r>
+    </w:p>
+    <w:p>
+      <w:pPr>
+        <w:rPr>
+          <w:lang w:val="en-US"/>
+        </w:rPr>
+      </w:pPr>
+      <w:r>
+        <w:rPr>
+          <w:lang w:val="en-US"/>
+        </w:rPr>
+        <w:t>Consequently, it is decided that WeatherManager be split into three classes:</w:t>
+      </w:r>
+    </w:p>
+    <w:p>
+      <w:pPr>
+        <w:rPr>
+          <w:lang w:val="en-US"/>
+        </w:rPr>
+      </w:pPr>
+      <w:r>
+        <w:rPr>
+          <w:lang w:val="en-US"/>
+        </w:rPr>
+        <w:t>WeatherSpawnManager: only addSpawnPoint and getSpawnPoints (ticked)</w:t>
+      </w:r>
+    </w:p>
+    <w:p>
+      <w:pPr>
+        <w:rPr>
+          <w:lang w:val="en-US"/>
+        </w:rPr>
+      </w:pPr>
+      <w:r>
+        <w:rPr>
+          <w:lang w:val="en-US"/>
+        </w:rPr>
+        <w:t xml:space="preserve">LightningManager: </w:t>
+      </w:r>
+      <w:r>
+        <w:rPr>
+          <w:lang w:val="en-US"/>
+        </w:rPr>
+        <w:t>only handle attractLightning</w:t>
+      </w:r>
+    </w:p>
+    <w:p>
+      <w:pPr>
+        <w:rPr>
+          <w:lang w:val="en-US"/>
+        </w:rPr>
+      </w:pPr>
+      <w:r>
+        <w:rPr>
+          <w:lang w:val="en-US"/>
+        </w:rPr>
+        <w:t>WeatherQueryManager: only handle isObscuring and isDamaging</w:t>
+      </w:r>
+    </w:p>
+    <w:p>
+      <w:pPr>
+        <w:rPr>
+          <w:lang w:val="en-US"/>
+        </w:rPr>
+      </w:pPr>
+      <w:r>
+        <w:rPr>
+          <w:lang w:val="en-US"/>
+        </w:rPr>
+        <w:t>With WeatherManager calling these classes for their modular portion of work in the existing methods.</w:t>
+      </w:r>
+    </w:p>
+    <w:p>
+      <w:pPr>
+        <w:rPr>
+          <w:lang w:val="en-US"/>
+        </w:rPr>
+      </w:pPr>
+      <w:r>
+        <w:rPr>
+          <w:lang w:val="en-US"/>
+        </w:rPr>
+        <w:t>--</w:t>
       </w:r>
     </w:p>
     <w:p>
@@ -480,9 +684,169 @@
       </w:pPr>
       <w:r>
         <w:rPr>
-          <w:lang w:val="en-US"/>
-        </w:rPr>
-        <w:t xml:space="preserve">Second, there is </w:t>
+          <w:noProof/>
+          <w:lang w:val="en-US"/>
+        </w:rPr>
+        <mc:AlternateContent>
+          <mc:Choice Requires="wps">
+            <w:drawing>
+              <wp:anchor distT="45720" distB="45720" distL="114300" distR="114300" simplePos="0" relativeHeight="251664384" behindDoc="0" locked="0" layoutInCell="1" allowOverlap="1" wp14:anchorId="3FC4DCC8" wp14:editId="608B7990">
+                <wp:simplePos x="0" y="0"/>
+                <wp:positionH relativeFrom="column">
+                  <wp:posOffset>2686944</wp:posOffset>
+                </wp:positionH>
+                <wp:positionV relativeFrom="paragraph">
+                  <wp:posOffset>306745</wp:posOffset>
+                </wp:positionV>
+                <wp:extent cx="2360930" cy="1404620"/>
+                <wp:effectExtent l="0" t="0" r="22860" b="11430"/>
+                <wp:wrapSquare wrapText="bothSides"/>
+                <wp:docPr id="779711960" name="Text Box 2"/>
+                <wp:cNvGraphicFramePr>
+                  <a:graphicFrameLocks xmlns:a="http://schemas.openxmlformats.org/drawingml/2006/main"/>
+                </wp:cNvGraphicFramePr>
+                <a:graphic xmlns:a="http://schemas.openxmlformats.org/drawingml/2006/main">
+                  <a:graphicData uri="http://schemas.microsoft.com/office/word/2010/wordprocessingShape">
+                    <wps:wsp>
+                      <wps:cNvSpPr txBox="1">
+                        <a:spLocks noChangeArrowheads="1"/>
+                      </wps:cNvSpPr>
+                      <wps:spPr bwMode="auto">
+                        <a:xfrm>
+                          <a:off x="0" y="0"/>
+                          <a:ext cx="2360930" cy="1404620"/>
+                        </a:xfrm>
+                        <a:prstGeom prst="rect">
+                          <a:avLst/>
+                        </a:prstGeom>
+                        <a:solidFill>
+                          <a:srgbClr val="FFFFFF"/>
+                        </a:solidFill>
+                        <a:ln w="9525">
+                          <a:solidFill>
+                            <a:srgbClr val="000000"/>
+                          </a:solidFill>
+                          <a:miter lim="800000"/>
+                          <a:headEnd/>
+                          <a:tailEnd/>
+                        </a:ln>
+                      </wps:spPr>
+                      <wps:txbx>
+                        <w:txbxContent>
+                          <w:p>
+                            <w:pPr>
+                              <w:rPr>
+                                <w:lang w:val="en-US"/>
+                              </w:rPr>
+                            </w:pPr>
+                            <w:r>
+                              <w:rPr>
+                                <w:lang w:val="en-US"/>
+                              </w:rPr>
+                              <w:t>High coupling between LightningManager and Lightning due to strong interconnections where changing one creates issues for the other.</w:t>
+                            </w:r>
+                          </w:p>
+                        </w:txbxContent>
+                      </wps:txbx>
+                      <wps:bodyPr rot="0" vert="horz" wrap="square" lIns="91440" tIns="45720" rIns="91440" bIns="45720" anchor="t" anchorCtr="0">
+                        <a:spAutoFit/>
+                      </wps:bodyPr>
+                    </wps:wsp>
+                  </a:graphicData>
+                </a:graphic>
+                <wp14:sizeRelH relativeFrom="margin">
+                  <wp14:pctWidth>40000</wp14:pctWidth>
+                </wp14:sizeRelH>
+                <wp14:sizeRelV relativeFrom="margin">
+                  <wp14:pctHeight>20000</wp14:pctHeight>
+                </wp14:sizeRelV>
+              </wp:anchor>
+            </w:drawing>
+          </mc:Choice>
+          <mc:Fallback>
+            <w:pict>
+              <v:shape w14:anchorId="3FC4DCC8" id="_x0000_s1027" type="#_x0000_t202" style="position:absolute;margin-left:211.55pt;margin-top:24.15pt;width:185.9pt;height:110.6pt;z-index:251664384;visibility:visible;mso-wrap-style:square;mso-width-percent:400;mso-height-percent:200;mso-wrap-distance-left:9pt;mso-wrap-distance-top:3.6pt;mso-wrap-distance-right:9pt;mso-wrap-distance-bottom:3.6pt;mso-position-horizontal:absolute;mso-position-horizontal-relative:text;mso-position-vertical:absolute;mso-position-vertical-relative:text;mso-width-percent:400;mso-height-percent:200;mso-width-relative:margin;mso-height-relative:margin;v-text-anchor:top" o:gfxdata="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">
+                <v:textbox style="mso-fit-shape-to-text:t">
+                  <w:txbxContent>
+                    <w:p>
+                      <w:pPr>
+                        <w:rPr>
+                          <w:lang w:val="en-US"/>
+                        </w:rPr>
+                      </w:pPr>
+                      <w:r>
+                        <w:rPr>
+                          <w:lang w:val="en-US"/>
+                        </w:rPr>
+                        <w:t>High coupling between LightningManager and Lightning due to strong interconnections where changing one creates issues for the other.</w:t>
+                      </w:r>
+                    </w:p>
+                  </w:txbxContent>
+                </v:textbox>
+                <w10:wrap type="square"/>
+              </v:shape>
+            </w:pict>
+          </mc:Fallback>
+        </mc:AlternateContent>
+      </w:r>
+      <w:r>
+        <w:rPr>
+          <w:lang w:val="en-US"/>
+        </w:rPr>
+        <w:drawing>
+          <wp:inline distT="0" distB="0" distL="0" distR="0" wp14:anchorId="64196D50" wp14:editId="726031CA">
+            <wp:extent cx="2533529" cy="1702729"/>
+            <wp:effectExtent l="0" t="0" r="635" b="0"/>
+            <wp:docPr id="1038792970" name="Picture 1"/>
+            <wp:cNvGraphicFramePr>
+              <a:graphicFrameLocks xmlns:a="http://schemas.openxmlformats.org/drawingml/2006/main" noChangeAspect="1"/>
+            </wp:cNvGraphicFramePr>
+            <a:graphic xmlns:a="http://schemas.openxmlformats.org/drawingml/2006/main">
+              <a:graphicData uri="http://schemas.openxmlformats.org/drawingml/2006/picture">
+                <pic:pic xmlns:pic="http://schemas.openxmlformats.org/drawingml/2006/picture">
+                  <pic:nvPicPr>
+                    <pic:cNvPr id="1038792970" name=""/>
+                    <pic:cNvPicPr/>
+                  </pic:nvPicPr>
+                  <pic:blipFill>
+                    <a:blip r:embed="rId8"/>
+                    <a:stretch>
+                      <a:fillRect/>
+                    </a:stretch>
+                  </pic:blipFill>
+                  <pic:spPr>
+                    <a:xfrm>
+                      <a:off x="0" y="0"/>
+                      <a:ext cx="2541656" cy="1708191"/>
+                    </a:xfrm>
+                    <a:prstGeom prst="rect">
+                      <a:avLst/>
+                    </a:prstGeom>
+                  </pic:spPr>
+                </pic:pic>
+              </a:graphicData>
+            </a:graphic>
+          </wp:inline>
+        </w:drawing>
+      </w:r>
+    </w:p>
+    <w:p>
+      <w:pPr>
+        <w:rPr>
+          <w:lang w:val="en-US"/>
+        </w:rPr>
+      </w:pPr>
+      <w:r>
+        <w:rPr>
+          <w:lang w:val="en-US"/>
+        </w:rPr>
+        <w:t>Second, there is</w:t>
+      </w:r>
+      <w:r>
+        <w:rPr>
+          <w:lang w:val="en-US"/>
+        </w:rPr>
+        <w:t xml:space="preserve"> </w:t>
       </w:r>
       <w:r>
         <w:rPr>
@@ -515,6 +879,7 @@
         <w:rPr>
           <w:noProof/>
         </w:rPr>
+        <w:lastRenderedPageBreak/>
         <mc:AlternateContent>
           <mc:Choice Requires="wpi">
             <w:drawing>
@@ -533,7 +898,7 @@
                 <wp:cNvGraphicFramePr/>
                 <a:graphic xmlns:a="http://schemas.openxmlformats.org/drawingml/2006/main">
                   <a:graphicData uri="http://schemas.microsoft.com/office/word/2010/wordprocessingInk">
-                    <w14:contentPart bwMode="auto" r:id="rId8">
+                    <w14:contentPart bwMode="auto" r:id="rId9">
                       <w14:nvContentPartPr>
                         <w14:cNvContentPartPr/>
                       </w14:nvContentPartPr>
@@ -549,7 +914,7 @@
           </mc:Choice>
           <mc:Fallback>
             <w:pict>
-              <v:shapetype w14:anchorId="70055A38" id="_x0000_t75" coordsize="21600,21600" o:spt="75" o:preferrelative="t" path="m@4@5l@4@11@9@11@9@5xe" filled="f" stroked="f">
+              <v:shapetype w14:anchorId="13D7FE9C" id="_x0000_t75" coordsize="21600,21600" o:spt="75" o:preferrelative="t" path="m@4@5l@4@11@9@11@9@5xe" filled="f" stroked="f">
                 <v:stroke joinstyle="miter"/>
                 <v:formulas>
                   <v:f eqn="if lineDrawn pixelLineWidth 0"/>
@@ -569,7 +934,7 @@
                 <o:lock v:ext="edit" aspectratio="t"/>
               </v:shapetype>
               <v:shape id="Ink 3" o:spid="_x0000_s1026" type="#_x0000_t75" style="position:absolute;margin-left:104.7pt;margin-top:170.4pt;width:13.5pt;height:30.7pt;z-index:251662336;visibility:visible;mso-wrap-style:square;mso-wrap-distance-left:9pt;mso-wrap-distance-top:0;mso-wrap-distance-right:9pt;mso-wrap-distance-bottom:0;mso-position-horizontal:absolute;mso-position-horizontal-relative:text;mso-position-vertical:absolute;mso-position-vertical-relative:text" o:gfxdata="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">
-                <v:imagedata r:id="rId9" o:title=""/>
+                <v:imagedata r:id="rId10" o:title=""/>
               </v:shape>
             </w:pict>
           </mc:Fallback>
@@ -636,7 +1001,6 @@
         <w:rPr>
           <w:lang w:val="en-US"/>
         </w:rPr>
-        <w:lastRenderedPageBreak/>
         <w:drawing>
           <wp:inline distT="0" distB="0" distL="0" distR="0" wp14:anchorId="067EDE16" wp14:editId="3FCF70A7">
             <wp:extent cx="6645910" cy="3313430"/>
@@ -653,7 +1017,7 @@
                     <pic:cNvPicPr/>
                   </pic:nvPicPr>
                   <pic:blipFill>
-                    <a:blip r:embed="rId10"/>
+                    <a:blip r:embed="rId11"/>
                     <a:stretch>
                       <a:fillRect/>
                     </a:stretch>
@@ -684,6 +1048,12 @@
         <w:rPr>
           <w:lang w:val="en-US"/>
         </w:rPr>
+        <w:t>Implementation moved to Lightning’s attractTo:</w:t>
+      </w:r>
+      <w:r>
+        <w:rPr>
+          <w:lang w:val="en-US"/>
+        </w:rPr>
         <w:drawing>
           <wp:inline distT="0" distB="0" distL="0" distR="0" wp14:anchorId="77547E5D" wp14:editId="66E176FA">
             <wp:extent cx="6645910" cy="2214880"/>
@@ -700,7 +1070,7 @@
                     <pic:cNvPicPr/>
                   </pic:nvPicPr>
                   <pic:blipFill>
-                    <a:blip r:embed="rId11"/>
+                    <a:blip r:embed="rId12"/>
                     <a:stretch>
                       <a:fillRect/>
                     </a:stretch>
@@ -732,6 +1102,7 @@
         <w:rPr>
           <w:lang w:val="en-US"/>
         </w:rPr>
+        <w:lastRenderedPageBreak/>
         <w:t>Cloud</w:t>
       </w:r>
       <w:r>
@@ -986,7 +1357,6 @@
         <w:pStyle w:val="Heading3"/>
       </w:pPr>
       <w:r>
-        <w:lastRenderedPageBreak/>
         <w:t>Field renaming</w:t>
       </w:r>
     </w:p>
@@ -1211,11 +1581,7 @@
           </mc:Choice>
           <mc:Fallback>
             <w:pict>
-              <v:shapetype w14:anchorId="6EC99913" id="_x0000_t202" coordsize="21600,21600" o:spt="202" path="m,l,21600r21600,l21600,xe">
-                <v:stroke joinstyle="miter"/>
-                <v:path gradientshapeok="t" o:connecttype="rect"/>
-              </v:shapetype>
-              <v:shape id="Text Box 2" o:spid="_x0000_s1026" type="#_x0000_t202" style="position:absolute;margin-left:0;margin-top:14.4pt;width:185.9pt;height:110.6pt;z-index:251659264;visibility:visible;mso-wrap-style:square;mso-width-percent:400;mso-height-percent:200;mso-wrap-distance-left:9pt;mso-wrap-distance-top:3.6pt;mso-wrap-distance-right:9pt;mso-wrap-distance-bottom:3.6pt;mso-position-horizontal:center;mso-position-horizontal-relative:text;mso-position-vertical:absolute;mso-position-vertical-relative:text;mso-width-percent:400;mso-height-percent:200;mso-width-relative:margin;mso-height-relative:margin;v-text-anchor:top" o:gfxdata="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">
+              <v:shape w14:anchorId="6EC99913" id="_x0000_s1028" type="#_x0000_t202" style="position:absolute;margin-left:0;margin-top:14.4pt;width:185.9pt;height:110.6pt;z-index:251659264;visibility:visible;mso-wrap-style:square;mso-width-percent:400;mso-height-percent:200;mso-wrap-distance-left:9pt;mso-wrap-distance-top:3.6pt;mso-wrap-distance-right:9pt;mso-wrap-distance-bottom:3.6pt;mso-position-horizontal:center;mso-position-horizontal-relative:text;mso-position-vertical:absolute;mso-position-vertical-relative:text;mso-width-percent:400;mso-height-percent:200;mso-width-relative:margin;mso-height-relative:margin;v-text-anchor:top" o:gfxdata="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">
                 <v:textbox style="mso-fit-shape-to-text:t">
                   <w:txbxContent>
                     <w:p>
@@ -1287,6 +1653,7 @@
         <w:pStyle w:val="Heading2"/>
       </w:pPr>
       <w:r>
+        <w:lastRenderedPageBreak/>
         <w:t>WeatherSpawnPoint</w:t>
       </w:r>
     </w:p>
@@ -1401,7 +1768,7 @@
                     <pic:cNvPicPr/>
                   </pic:nvPicPr>
                   <pic:blipFill>
-                    <a:blip r:embed="rId12"/>
+                    <a:blip r:embed="rId13"/>
                     <a:stretch>
                       <a:fillRect/>
                     </a:stretch>
@@ -1427,7 +1794,6 @@
         <w:rPr>
           <w:noProof/>
         </w:rPr>
-        <w:lastRenderedPageBreak/>
         <w:drawing>
           <wp:inline distT="0" distB="0" distL="0" distR="0" wp14:anchorId="7DE3BE26" wp14:editId="3FF76637">
             <wp:extent cx="5731510" cy="1257935"/>
@@ -1444,7 +1810,7 @@
                     <pic:cNvPicPr/>
                   </pic:nvPicPr>
                   <pic:blipFill>
-                    <a:blip r:embed="rId13"/>
+                    <a:blip r:embed="rId14"/>
                     <a:stretch>
                       <a:fillRect/>
                     </a:stretch>
@@ -1540,10 +1906,18 @@
           <w:tab w:val="left" w:pos="2518"/>
         </w:tabs>
       </w:pPr>
+    </w:p>
+    <w:p>
+      <w:pPr>
+        <w:tabs>
+          <w:tab w:val="left" w:pos="2518"/>
+        </w:tabs>
+      </w:pPr>
       <w:r>
         <w:rPr>
           <w:noProof/>
         </w:rPr>
+        <w:lastRenderedPageBreak/>
         <mc:AlternateContent>
           <mc:Choice Requires="wps">
             <w:drawing>
@@ -1654,7 +2028,7 @@
           </mc:Choice>
           <mc:Fallback>
             <w:pict>
-              <v:shape w14:anchorId="7AF5B014" id="_x0000_s1027" type="#_x0000_t202" style="position:absolute;margin-left:0;margin-top:14.4pt;width:185.9pt;height:110.6pt;z-index:251661312;visibility:visible;mso-wrap-style:square;mso-width-percent:400;mso-height-percent:200;mso-wrap-distance-left:9pt;mso-wrap-distance-top:3.6pt;mso-wrap-distance-right:9pt;mso-wrap-distance-bottom:3.6pt;mso-position-horizontal:center;mso-position-horizontal-relative:text;mso-position-vertical:absolute;mso-position-vertical-relative:text;mso-width-percent:400;mso-height-percent:200;mso-width-relative:margin;mso-height-relative:margin;v-text-anchor:top" o:gfxdata="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">
+              <v:shape w14:anchorId="7AF5B014" id="_x0000_s1029" type="#_x0000_t202" style="position:absolute;margin-left:0;margin-top:14.4pt;width:185.9pt;height:110.6pt;z-index:251661312;visibility:visible;mso-wrap-style:square;mso-width-percent:400;mso-height-percent:200;mso-wrap-distance-left:9pt;mso-wrap-distance-top:3.6pt;mso-wrap-distance-right:9pt;mso-wrap-distance-bottom:3.6pt;mso-position-horizontal:center;mso-position-horizontal-relative:text;mso-position-vertical:absolute;mso-position-vertical-relative:text;mso-width-percent:400;mso-height-percent:200;mso-width-relative:margin;mso-height-relative:margin;v-text-anchor:top" o:gfxdata="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">
                 <v:textbox style="mso-fit-shape-to-text:t">
                   <w:txbxContent>
                     <w:p>
@@ -1709,6 +2083,106 @@
             </w:pict>
           </mc:Fallback>
         </mc:AlternateContent>
+      </w:r>
+    </w:p>
+    <w:p>
+      <w:pPr>
+        <w:tabs>
+          <w:tab w:val="left" w:pos="2518"/>
+        </w:tabs>
+      </w:pPr>
+    </w:p>
+    <w:p>
+      <w:pPr>
+        <w:tabs>
+          <w:tab w:val="left" w:pos="2518"/>
+        </w:tabs>
+      </w:pPr>
+    </w:p>
+    <w:p>
+      <w:pPr>
+        <w:rPr>
+          <w:lang w:val="en-US"/>
+        </w:rPr>
+      </w:pPr>
+      <w:r>
+        <w:rPr>
+          <w:b/>
+          <w:bCs/>
+          <w:lang w:val="en-US"/>
+        </w:rPr>
+        <w:t>Defensive programming</w:t>
+      </w:r>
+      <w:r>
+        <w:rPr>
+          <w:lang w:val="en-US"/>
+        </w:rPr>
+        <w:t xml:space="preserve">: instead of adding it to a final array list, </w:t>
+      </w:r>
+    </w:p>
+    <w:p>
+      <w:r>
+        <w:t xml:space="preserve">return </w:t>
+      </w:r>
+      <w:r>
+        <w:t>new</w:t>
+      </w:r>
+      <w:r>
+        <w:t xml:space="preserve"> ArrayList&lt;&gt;(phenomena);</w:t>
+      </w:r>
+    </w:p>
+    <w:p>
+      <w:pPr>
+        <w:rPr>
+          <w:lang w:val="en-US"/>
+        </w:rPr>
+      </w:pPr>
+    </w:p>
+    <w:p>
+      <w:pPr>
+        <w:rPr>
+          <w:lang w:val="en-US"/>
+        </w:rPr>
+      </w:pPr>
+      <w:r>
+        <w:rPr>
+          <w:lang w:val="en-US"/>
+        </w:rPr>
+        <w:drawing>
+          <wp:inline distT="0" distB="0" distL="0" distR="0" wp14:anchorId="4BDCD5C9" wp14:editId="72024C4B">
+            <wp:extent cx="5731510" cy="2249170"/>
+            <wp:effectExtent l="0" t="0" r="2540" b="0"/>
+            <wp:docPr id="515675042" name="Picture 1"/>
+            <wp:cNvGraphicFramePr>
+              <a:graphicFrameLocks xmlns:a="http://schemas.openxmlformats.org/drawingml/2006/main" noChangeAspect="1"/>
+            </wp:cNvGraphicFramePr>
+            <a:graphic xmlns:a="http://schemas.openxmlformats.org/drawingml/2006/main">
+              <a:graphicData uri="http://schemas.openxmlformats.org/drawingml/2006/picture">
+                <pic:pic xmlns:pic="http://schemas.openxmlformats.org/drawingml/2006/picture">
+                  <pic:nvPicPr>
+                    <pic:cNvPr id="515675042" name=""/>
+                    <pic:cNvPicPr/>
+                  </pic:nvPicPr>
+                  <pic:blipFill>
+                    <a:blip r:embed="rId15"/>
+                    <a:stretch>
+                      <a:fillRect/>
+                    </a:stretch>
+                  </pic:blipFill>
+                  <pic:spPr>
+                    <a:xfrm>
+                      <a:off x="0" y="0"/>
+                      <a:ext cx="5731510" cy="2249170"/>
+                    </a:xfrm>
+                    <a:prstGeom prst="rect">
+                      <a:avLst/>
+                    </a:prstGeom>
+                  </pic:spPr>
+                </pic:pic>
+              </a:graphicData>
+            </a:graphic>
+          </wp:inline>
+        </w:drawing>
       </w:r>
     </w:p>
     <w:p>

</xml_diff>

<commit_message>
removed some magic numbers
</commit_message>
<xml_diff>
--- a/Justification.docx
+++ b/Justification.docx
@@ -637,31 +637,6 @@
         </w:rPr>
         <w:t xml:space="preserve"> Nevertheless, this idea is documented for evidence of thinking.</w:t>
       </w:r>
-      <w:r>
-        <w:rPr>
-          <w:lang w:val="en-US"/>
-        </w:rPr>
-        <w:t xml:space="preserve"> </w:t>
-      </w:r>
-      <w:r>
-        <w:rPr>
-          <mc:AlternateContent>
-            <mc:Choice Requires="w16se"/>
-            <mc:Fallback>
-              <w:rFonts w:ascii="Segoe UI Emoji" w:eastAsia="Segoe UI Emoji" w:hAnsi="Segoe UI Emoji" w:cs="Segoe UI Emoji"/>
-            </mc:Fallback>
-          </mc:AlternateContent>
-          <w:lang w:val="en-US"/>
-        </w:rPr>
-        <mc:AlternateContent>
-          <mc:Choice Requires="w16se">
-            <w16se:symEx w16se:font="Segoe UI Emoji" w16se:char="1F60A"/>
-          </mc:Choice>
-          <mc:Fallback>
-            <w:t>😊</w:t>
-          </mc:Fallback>
-        </mc:AlternateContent>
-      </w:r>
     </w:p>
     <w:p>
       <w:pPr>
@@ -914,7 +889,7 @@
           </mc:Choice>
           <mc:Fallback>
             <w:pict>
-              <v:shapetype w14:anchorId="13D7FE9C" id="_x0000_t75" coordsize="21600,21600" o:spt="75" o:preferrelative="t" path="m@4@5l@4@11@9@11@9@5xe" filled="f" stroked="f">
+              <v:shapetype w14:anchorId="0C7199EF" id="_x0000_t75" coordsize="21600,21600" o:spt="75" o:preferrelative="t" path="m@4@5l@4@11@9@11@9@5xe" filled="f" stroked="f">
                 <v:stroke joinstyle="miter"/>
                 <v:formulas>
                   <v:f eqn="if lineDrawn pixelLineWidth 0"/>
@@ -988,6 +963,12 @@
         <w:rPr>
           <w:lang w:val="en-US"/>
         </w:rPr>
+        <w:t xml:space="preserve">This is a code smell too, as LightningManager seems more interested in another class, Lightning’s data than its own here. </w:t>
+      </w:r>
+      <w:r>
+        <w:rPr>
+          <w:lang w:val="en-US"/>
+        </w:rPr>
         <w:t xml:space="preserve">To fix, the set position task is delegated to Lightning, which is implemented using the interface attractTo method present in Attractable too. </w:t>
       </w:r>
     </w:p>
@@ -1093,6 +1074,254 @@
     </w:p>
     <w:p>
       <w:pPr>
+        <w:rPr>
+          <w:lang w:val="en-US"/>
+        </w:rPr>
+      </w:pPr>
+      <w:r>
+        <w:rPr>
+          <w:lang w:val="en-US"/>
+        </w:rPr>
+        <w:lastRenderedPageBreak/>
+        <w:t>Now the LightningManager is adapted to:</w:t>
+      </w:r>
+    </w:p>
+    <w:p>
+      <w:pPr>
+        <w:rPr>
+          <w:lang w:val="en-US"/>
+        </w:rPr>
+      </w:pPr>
+      <w:r>
+        <w:rPr>
+          <w:lang w:val="en-US"/>
+        </w:rPr>
+        <w:drawing>
+          <wp:inline distT="0" distB="0" distL="0" distR="0" wp14:anchorId="488CF0B6" wp14:editId="695568D8">
+            <wp:extent cx="6645910" cy="3251200"/>
+            <wp:effectExtent l="0" t="0" r="2540" b="6350"/>
+            <wp:docPr id="829815529" name="Picture 1"/>
+            <wp:cNvGraphicFramePr>
+              <a:graphicFrameLocks xmlns:a="http://schemas.openxmlformats.org/drawingml/2006/main" noChangeAspect="1"/>
+            </wp:cNvGraphicFramePr>
+            <a:graphic xmlns:a="http://schemas.openxmlformats.org/drawingml/2006/main">
+              <a:graphicData uri="http://schemas.openxmlformats.org/drawingml/2006/picture">
+                <pic:pic xmlns:pic="http://schemas.openxmlformats.org/drawingml/2006/picture">
+                  <pic:nvPicPr>
+                    <pic:cNvPr id="829815529" name=""/>
+                    <pic:cNvPicPr/>
+                  </pic:nvPicPr>
+                  <pic:blipFill>
+                    <a:blip r:embed="rId13"/>
+                    <a:stretch>
+                      <a:fillRect/>
+                    </a:stretch>
+                  </pic:blipFill>
+                  <pic:spPr>
+                    <a:xfrm>
+                      <a:off x="0" y="0"/>
+                      <a:ext cx="6645910" cy="3251200"/>
+                    </a:xfrm>
+                    <a:prstGeom prst="rect">
+                      <a:avLst/>
+                    </a:prstGeom>
+                  </pic:spPr>
+                </pic:pic>
+              </a:graphicData>
+            </a:graphic>
+          </wp:inline>
+        </w:drawing>
+      </w:r>
+    </w:p>
+    <w:p>
+      <w:pPr>
+        <w:rPr>
+          <w:lang w:val="en-US"/>
+        </w:rPr>
+      </w:pPr>
+    </w:p>
+    <w:p>
+      <w:pPr>
+        <w:rPr>
+          <w:lang w:val="en-US"/>
+        </w:rPr>
+      </w:pPr>
+      <w:r>
+        <w:rPr>
+          <w:noProof/>
+          <w:lang w:val="en-US"/>
+        </w:rPr>
+        <mc:AlternateContent>
+          <mc:Choice Requires="wps">
+            <w:drawing>
+              <wp:anchor distT="45720" distB="45720" distL="114300" distR="114300" simplePos="0" relativeHeight="251674624" behindDoc="0" locked="0" layoutInCell="1" allowOverlap="1" wp14:anchorId="243167AE" wp14:editId="3D31D791">
+                <wp:simplePos x="0" y="0"/>
+                <wp:positionH relativeFrom="column">
+                  <wp:posOffset>3094990</wp:posOffset>
+                </wp:positionH>
+                <wp:positionV relativeFrom="paragraph">
+                  <wp:posOffset>394335</wp:posOffset>
+                </wp:positionV>
+                <wp:extent cx="2457450" cy="366395"/>
+                <wp:effectExtent l="0" t="0" r="19050" b="14605"/>
+                <wp:wrapSquare wrapText="bothSides"/>
+                <wp:docPr id="732292160" name="Text Box 2"/>
+                <wp:cNvGraphicFramePr>
+                  <a:graphicFrameLocks xmlns:a="http://schemas.openxmlformats.org/drawingml/2006/main"/>
+                </wp:cNvGraphicFramePr>
+                <a:graphic xmlns:a="http://schemas.openxmlformats.org/drawingml/2006/main">
+                  <a:graphicData uri="http://schemas.microsoft.com/office/word/2010/wordprocessingShape">
+                    <wps:wsp>
+                      <wps:cNvSpPr txBox="1">
+                        <a:spLocks noChangeArrowheads="1"/>
+                      </wps:cNvSpPr>
+                      <wps:spPr bwMode="auto">
+                        <a:xfrm>
+                          <a:off x="0" y="0"/>
+                          <a:ext cx="2457450" cy="366395"/>
+                        </a:xfrm>
+                        <a:prstGeom prst="rect">
+                          <a:avLst/>
+                        </a:prstGeom>
+                        <a:solidFill>
+                          <a:srgbClr val="FFFFFF"/>
+                        </a:solidFill>
+                        <a:ln w="9525">
+                          <a:solidFill>
+                            <a:srgbClr val="000000"/>
+                          </a:solidFill>
+                          <a:miter lim="800000"/>
+                          <a:headEnd/>
+                          <a:tailEnd/>
+                        </a:ln>
+                      </wps:spPr>
+                      <wps:txbx>
+                        <w:txbxContent>
+                          <w:p>
+                            <w:pPr>
+                              <w:rPr>
+                                <w:lang w:val="en-US"/>
+                              </w:rPr>
+                            </w:pPr>
+                            <w:r>
+                              <w:rPr>
+                                <w:lang w:val="en-US"/>
+                              </w:rPr>
+                              <w:t>So that</w:t>
+                            </w:r>
+                            <w:r>
+                              <w:rPr>
+                                <w:lang w:val="en-US"/>
+                              </w:rPr>
+                              <w:t xml:space="preserve"> coupling is reduced! :)</w:t>
+                            </w:r>
+                          </w:p>
+                          <w:p>
+                            <w:pPr>
+                              <w:rPr>
+                                <w:lang w:val="en-US"/>
+                              </w:rPr>
+                            </w:pPr>
+                          </w:p>
+                        </w:txbxContent>
+                      </wps:txbx>
+                      <wps:bodyPr rot="0" vert="horz" wrap="square" lIns="91440" tIns="45720" rIns="91440" bIns="45720" anchor="t" anchorCtr="0">
+                        <a:noAutofit/>
+                      </wps:bodyPr>
+                    </wps:wsp>
+                  </a:graphicData>
+                </a:graphic>
+                <wp14:sizeRelH relativeFrom="margin">
+                  <wp14:pctWidth>0</wp14:pctWidth>
+                </wp14:sizeRelH>
+                <wp14:sizeRelV relativeFrom="margin">
+                  <wp14:pctHeight>0</wp14:pctHeight>
+                </wp14:sizeRelV>
+              </wp:anchor>
+            </w:drawing>
+          </mc:Choice>
+          <mc:Fallback>
+            <w:pict>
+              <v:shape w14:anchorId="243167AE" id="_x0000_s1028" type="#_x0000_t202" style="position:absolute;margin-left:243.7pt;margin-top:31.05pt;width:193.5pt;height:28.85pt;z-index:251674624;visibility:visible;mso-wrap-style:square;mso-width-percent:0;mso-height-percent:0;mso-wrap-distance-left:9pt;mso-wrap-distance-top:3.6pt;mso-wrap-distance-right:9pt;mso-wrap-distance-bottom:3.6pt;mso-position-horizontal:absolute;mso-position-horizontal-relative:text;mso-position-vertical:absolute;mso-position-vertical-relative:text;mso-width-percent:0;mso-height-percent:0;mso-width-relative:margin;mso-height-relative:margin;v-text-anchor:top" o:gfxdata="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">
+                <v:textbox>
+                  <w:txbxContent>
+                    <w:p>
+                      <w:pPr>
+                        <w:rPr>
+                          <w:lang w:val="en-US"/>
+                        </w:rPr>
+                      </w:pPr>
+                      <w:r>
+                        <w:rPr>
+                          <w:lang w:val="en-US"/>
+                        </w:rPr>
+                        <w:t>So that</w:t>
+                      </w:r>
+                      <w:r>
+                        <w:rPr>
+                          <w:lang w:val="en-US"/>
+                        </w:rPr>
+                        <w:t xml:space="preserve"> coupling is reduced! :)</w:t>
+                      </w:r>
+                    </w:p>
+                    <w:p>
+                      <w:pPr>
+                        <w:rPr>
+                          <w:lang w:val="en-US"/>
+                        </w:rPr>
+                      </w:pPr>
+                    </w:p>
+                  </w:txbxContent>
+                </v:textbox>
+                <w10:wrap type="square"/>
+              </v:shape>
+            </w:pict>
+          </mc:Fallback>
+        </mc:AlternateContent>
+      </w:r>
+      <w:r>
+        <w:rPr>
+          <w:lang w:val="en-US"/>
+        </w:rPr>
+        <w:drawing>
+          <wp:inline distT="0" distB="0" distL="0" distR="0" wp14:anchorId="782DCAD2" wp14:editId="0FCAC956">
+            <wp:extent cx="2941223" cy="1860062"/>
+            <wp:effectExtent l="0" t="0" r="0" b="6985"/>
+            <wp:docPr id="871907460" name="Picture 1"/>
+            <wp:cNvGraphicFramePr>
+              <a:graphicFrameLocks xmlns:a="http://schemas.openxmlformats.org/drawingml/2006/main" noChangeAspect="1"/>
+            </wp:cNvGraphicFramePr>
+            <a:graphic xmlns:a="http://schemas.openxmlformats.org/drawingml/2006/main">
+              <a:graphicData uri="http://schemas.openxmlformats.org/drawingml/2006/picture">
+                <pic:pic xmlns:pic="http://schemas.openxmlformats.org/drawingml/2006/picture">
+                  <pic:nvPicPr>
+                    <pic:cNvPr id="871907460" name=""/>
+                    <pic:cNvPicPr/>
+                  </pic:nvPicPr>
+                  <pic:blipFill>
+                    <a:blip r:embed="rId14"/>
+                    <a:stretch>
+                      <a:fillRect/>
+                    </a:stretch>
+                  </pic:blipFill>
+                  <pic:spPr>
+                    <a:xfrm>
+                      <a:off x="0" y="0"/>
+                      <a:ext cx="2948609" cy="1864733"/>
+                    </a:xfrm>
+                    <a:prstGeom prst="rect">
+                      <a:avLst/>
+                    </a:prstGeom>
+                  </pic:spPr>
+                </pic:pic>
+              </a:graphicData>
+            </a:graphic>
+          </wp:inline>
+        </w:drawing>
+      </w:r>
+    </w:p>
+    <w:p>
+      <w:pPr>
         <w:pStyle w:val="Heading2"/>
         <w:rPr>
           <w:lang w:val="en-US"/>
@@ -1102,7 +1331,6 @@
         <w:rPr>
           <w:lang w:val="en-US"/>
         </w:rPr>
-        <w:lastRenderedPageBreak/>
         <w:t>Cloud</w:t>
       </w:r>
       <w:r>
@@ -1357,7 +1585,189 @@
         <w:pStyle w:val="Heading3"/>
       </w:pPr>
       <w:r>
-        <w:t>Field renaming</w:t>
+        <w:lastRenderedPageBreak/>
+        <w:t>Code smells</w:t>
+      </w:r>
+    </w:p>
+    <w:p>
+      <w:pPr>
+        <w:pStyle w:val="Heading4"/>
+      </w:pPr>
+      <w:r>
+        <w:t>Inconsistent Logic</w:t>
+      </w:r>
+    </w:p>
+    <w:p>
+      <w:r>
+        <w:t>Cloud.java used to have a fixed implementation that freezes cloud movement once it reaches boundary, which neither RainCloud nor AcidCloud do. Hence, upon refactoring all clouds are removed cleanly once they’ve moved across the screen.</w:t>
+      </w:r>
+    </w:p>
+    <w:p>
+      <w:pPr>
+        <w:pStyle w:val="Heading4"/>
+      </w:pPr>
+      <w:r>
+        <w:t>Duplication</w:t>
+      </w:r>
+    </w:p>
+    <w:p>
+      <w:r>
+        <w:t xml:space="preserve">Boundary checking before marking for removal is duplicated in every cloud class. This is bad, because fixing one means fixing all. Hence, it was moved to the Cloudable mother class and now occurs just once and for all. </w:t>
+      </w:r>
+    </w:p>
+    <w:p>
+      <w:r>
+        <w:drawing>
+          <wp:inline distT="0" distB="0" distL="0" distR="0" wp14:anchorId="21AE251D" wp14:editId="11ED2A7A">
+            <wp:extent cx="6645910" cy="1880235"/>
+            <wp:effectExtent l="0" t="0" r="2540" b="5715"/>
+            <wp:docPr id="1470081677" name="Picture 1"/>
+            <wp:cNvGraphicFramePr>
+              <a:graphicFrameLocks xmlns:a="http://schemas.openxmlformats.org/drawingml/2006/main" noChangeAspect="1"/>
+            </wp:cNvGraphicFramePr>
+            <a:graphic xmlns:a="http://schemas.openxmlformats.org/drawingml/2006/main">
+              <a:graphicData uri="http://schemas.openxmlformats.org/drawingml/2006/picture">
+                <pic:pic xmlns:pic="http://schemas.openxmlformats.org/drawingml/2006/picture">
+                  <pic:nvPicPr>
+                    <pic:cNvPr id="1470081677" name=""/>
+                    <pic:cNvPicPr/>
+                  </pic:nvPicPr>
+                  <pic:blipFill>
+                    <a:blip r:embed="rId15"/>
+                    <a:stretch>
+                      <a:fillRect/>
+                    </a:stretch>
+                  </pic:blipFill>
+                  <pic:spPr>
+                    <a:xfrm>
+                      <a:off x="0" y="0"/>
+                      <a:ext cx="6645910" cy="1880235"/>
+                    </a:xfrm>
+                    <a:prstGeom prst="rect">
+                      <a:avLst/>
+                    </a:prstGeom>
+                  </pic:spPr>
+                </pic:pic>
+              </a:graphicData>
+            </a:graphic>
+          </wp:inline>
+        </w:drawing>
+      </w:r>
+    </w:p>
+    <w:p>
+      <w:r>
+        <w:rPr>
+          <w:noProof/>
+        </w:rPr>
+        <mc:AlternateContent>
+          <mc:Choice Requires="wps">
+            <w:drawing>
+              <wp:anchor distT="45720" distB="45720" distL="114300" distR="114300" simplePos="0" relativeHeight="251668480" behindDoc="0" locked="0" layoutInCell="1" allowOverlap="1" wp14:anchorId="134F657F" wp14:editId="19485057">
+                <wp:simplePos x="0" y="0"/>
+                <wp:positionH relativeFrom="column">
+                  <wp:posOffset>439473</wp:posOffset>
+                </wp:positionH>
+                <wp:positionV relativeFrom="paragraph">
+                  <wp:posOffset>697942</wp:posOffset>
+                </wp:positionV>
+                <wp:extent cx="4542790" cy="692785"/>
+                <wp:effectExtent l="0" t="0" r="0" b="0"/>
+                <wp:wrapTopAndBottom/>
+                <wp:docPr id="324235673" name="Text Box 2"/>
+                <wp:cNvGraphicFramePr>
+                  <a:graphicFrameLocks xmlns:a="http://schemas.openxmlformats.org/drawingml/2006/main"/>
+                </wp:cNvGraphicFramePr>
+                <a:graphic xmlns:a="http://schemas.openxmlformats.org/drawingml/2006/main">
+                  <a:graphicData uri="http://schemas.microsoft.com/office/word/2010/wordprocessingShape">
+                    <wps:wsp>
+                      <wps:cNvSpPr txBox="1">
+                        <a:spLocks noChangeArrowheads="1"/>
+                      </wps:cNvSpPr>
+                      <wps:spPr bwMode="auto">
+                        <a:xfrm>
+                          <a:off x="0" y="0"/>
+                          <a:ext cx="4542790" cy="692785"/>
+                        </a:xfrm>
+                        <a:prstGeom prst="rect">
+                          <a:avLst/>
+                        </a:prstGeom>
+                        <a:solidFill>
+                          <a:schemeClr val="tx2">
+                            <a:lumMod val="10000"/>
+                            <a:lumOff val="90000"/>
+                          </a:schemeClr>
+                        </a:solidFill>
+                        <a:ln w="9525">
+                          <a:noFill/>
+                          <a:miter lim="800000"/>
+                          <a:headEnd/>
+                          <a:tailEnd/>
+                        </a:ln>
+                      </wps:spPr>
+                      <wps:txbx>
+                        <w:txbxContent>
+                          <w:p>
+                            <w:r>
+                              <w:t>private int currentArtFrame = 1;</w:t>
+                            </w:r>
+                          </w:p>
+                          <w:p>
+                            <w:r>
+                              <w:t>private final TickTimer animTimer = new RepeatingTimer(12);</w:t>
+                            </w:r>
+                          </w:p>
+                          <w:p/>
+                        </w:txbxContent>
+                      </wps:txbx>
+                      <wps:bodyPr rot="0" vert="horz" wrap="square" lIns="91440" tIns="45720" rIns="91440" bIns="45720" anchor="t" anchorCtr="0">
+                        <a:noAutofit/>
+                      </wps:bodyPr>
+                    </wps:wsp>
+                  </a:graphicData>
+                </a:graphic>
+                <wp14:sizeRelH relativeFrom="margin">
+                  <wp14:pctWidth>0</wp14:pctWidth>
+                </wp14:sizeRelH>
+                <wp14:sizeRelV relativeFrom="margin">
+                  <wp14:pctHeight>0</wp14:pctHeight>
+                </wp14:sizeRelV>
+              </wp:anchor>
+            </w:drawing>
+          </mc:Choice>
+          <mc:Fallback>
+            <w:pict>
+              <v:shape w14:anchorId="134F657F" id="_x0000_s1029" type="#_x0000_t202" style="position:absolute;margin-left:34.6pt;margin-top:54.95pt;width:357.7pt;height:54.55pt;z-index:251668480;visibility:visible;mso-wrap-style:square;mso-width-percent:0;mso-height-percent:0;mso-wrap-distance-left:9pt;mso-wrap-distance-top:3.6pt;mso-wrap-distance-right:9pt;mso-wrap-distance-bottom:3.6pt;mso-position-horizontal:absolute;mso-position-horizontal-relative:text;mso-position-vertical:absolute;mso-position-vertical-relative:text;mso-width-percent:0;mso-height-percent:0;mso-width-relative:margin;mso-height-relative:margin;v-text-anchor:top" o:gfxdata="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" fillcolor="#dceaf7 [351]" stroked="f">
+                <v:textbox>
+                  <w:txbxContent>
+                    <w:p>
+                      <w:r>
+                        <w:t>private int currentArtFrame = 1;</w:t>
+                      </w:r>
+                    </w:p>
+                    <w:p>
+                      <w:r>
+                        <w:t>private final TickTimer animTimer = new RepeatingTimer(12);</w:t>
+                      </w:r>
+                    </w:p>
+                    <w:p/>
+                  </w:txbxContent>
+                </v:textbox>
+                <w10:wrap type="topAndBottom"/>
+              </v:shape>
+            </w:pict>
+          </mc:Fallback>
+        </mc:AlternateContent>
+      </w:r>
+      <w:r>
+        <w:t>Likewise, Cloud, RainCloud and AcidCloud all had their own animation fields like currentArtFrame and animTimer. This wastes memory, can cause inconsistent behaviour and is difficult to mass-alter if the timer is suddenly changed due to client requests.</w:t>
+      </w:r>
+    </w:p>
+    <w:p>
+      <w:pPr>
+        <w:pStyle w:val="Heading4"/>
+      </w:pPr>
+      <w:r>
+        <w:t>Bad Naming</w:t>
       </w:r>
     </w:p>
     <w:p>
@@ -1365,13 +1775,16 @@
         <w:pStyle w:val="ListParagraph"/>
         <w:numPr>
           <w:ilvl w:val="0"/>
-          <w:numId w:val="3"/>
+          <w:numId w:val="6"/>
         </w:numPr>
         <w:tabs>
           <w:tab w:val="left" w:pos="2518"/>
         </w:tabs>
       </w:pPr>
       <w:r>
+        <w:t xml:space="preserve">Changed to: </w:t>
+      </w:r>
+      <w:r>
         <w:t xml:space="preserve">private final TickTimer </w:t>
       </w:r>
       <w:r>
@@ -1390,15 +1803,34 @@
         <w:tabs>
           <w:tab w:val="left" w:pos="2518"/>
         </w:tabs>
-        <w:rPr>
-          <w:lang w:val="en-US"/>
-        </w:rPr>
-      </w:pPr>
-      <w:r>
-        <w:rPr>
-          <w:lang w:val="en-US"/>
-        </w:rPr>
-        <w:t xml:space="preserve">instead of </w:t>
+      </w:pPr>
+      <w:r>
+        <w:rPr>
+          <w:lang w:val="en-US"/>
+        </w:rPr>
+        <w:t>instead of</w:t>
+      </w:r>
+      <w:r>
+        <w:rPr>
+          <w:lang w:val="en-US"/>
+        </w:rPr>
+        <w:t xml:space="preserve">: </w:t>
+      </w:r>
+      <w:r>
+        <w:t xml:space="preserve">private final TickTimer </w:t>
+      </w:r>
+      <w:r>
+        <w:rPr>
+          <w:b/>
+          <w:bCs/>
+        </w:rPr>
+        <w:t>timer</w:t>
+      </w:r>
+      <w:r>
+        <w:t>;</w:t>
+      </w:r>
+      <w:r>
+        <w:t xml:space="preserve"> </w:t>
       </w:r>
     </w:p>
     <w:p>
@@ -1408,23 +1840,10 @@
         </w:tabs>
       </w:pPr>
       <w:r>
-        <w:t xml:space="preserve">private final TickTimer </w:t>
-      </w:r>
-      <w:r>
-        <w:rPr>
-          <w:b/>
-          <w:bCs/>
-        </w:rPr>
-        <w:t>timer</w:t>
-      </w:r>
-      <w:r>
-        <w:t>;</w:t>
-      </w:r>
-      <w:r>
-        <w:t xml:space="preserve"> // </w:t>
-      </w:r>
-      <w:r>
-        <w:t xml:space="preserve">since this is </w:t>
+        <w:t>S</w:t>
+      </w:r>
+      <w:r>
+        <w:t xml:space="preserve">ince this is </w:t>
       </w:r>
       <w:r>
         <w:t>less clear what timer this</w:t>
@@ -1437,6 +1856,382 @@
       </w:r>
       <w:r>
         <w:t>)</w:t>
+      </w:r>
+    </w:p>
+    <w:p>
+      <w:pPr>
+        <w:tabs>
+          <w:tab w:val="left" w:pos="2518"/>
+        </w:tabs>
+      </w:pPr>
+      <w:r>
+        <w:t>--</w:t>
+      </w:r>
+    </w:p>
+    <w:p>
+      <w:pPr>
+        <w:tabs>
+          <w:tab w:val="left" w:pos="2518"/>
+        </w:tabs>
+      </w:pPr>
+      <w:r>
+        <w:t xml:space="preserve">2. </w:t>
+      </w:r>
+      <w:r>
+        <w:t>Misleading method name</w:t>
+      </w:r>
+      <w:r>
+        <w:t>:</w:t>
+      </w:r>
+      <w:r>
+        <w:t xml:space="preserve"> setDamage suggets it stores some Damage object, but it only sets a boolean. A better name would be makeDamaged to meaningfully communicate the object getting this method will be damaged. However, this change cannot be done as the provided tests will not pass.</w:t>
+      </w:r>
+    </w:p>
+    <w:p>
+      <w:pPr>
+        <w:tabs>
+          <w:tab w:val="left" w:pos="2518"/>
+        </w:tabs>
+      </w:pPr>
+      <w:r>
+        <w:drawing>
+          <wp:inline distT="0" distB="0" distL="0" distR="0" wp14:anchorId="72A384F2" wp14:editId="1182A1E3">
+            <wp:extent cx="5259256" cy="1460290"/>
+            <wp:effectExtent l="0" t="0" r="0" b="6985"/>
+            <wp:docPr id="1337068179" name="Picture 1"/>
+            <wp:cNvGraphicFramePr>
+              <a:graphicFrameLocks xmlns:a="http://schemas.openxmlformats.org/drawingml/2006/main" noChangeAspect="1"/>
+            </wp:cNvGraphicFramePr>
+            <a:graphic xmlns:a="http://schemas.openxmlformats.org/drawingml/2006/main">
+              <a:graphicData uri="http://schemas.openxmlformats.org/drawingml/2006/picture">
+                <pic:pic xmlns:pic="http://schemas.openxmlformats.org/drawingml/2006/picture">
+                  <pic:nvPicPr>
+                    <pic:cNvPr id="1337068179" name=""/>
+                    <pic:cNvPicPr/>
+                  </pic:nvPicPr>
+                  <pic:blipFill>
+                    <a:blip r:embed="rId16"/>
+                    <a:stretch>
+                      <a:fillRect/>
+                    </a:stretch>
+                  </pic:blipFill>
+                  <pic:spPr>
+                    <a:xfrm>
+                      <a:off x="0" y="0"/>
+                      <a:ext cx="5271840" cy="1463784"/>
+                    </a:xfrm>
+                    <a:prstGeom prst="rect">
+                      <a:avLst/>
+                    </a:prstGeom>
+                  </pic:spPr>
+                </pic:pic>
+              </a:graphicData>
+            </a:graphic>
+          </wp:inline>
+        </w:drawing>
+      </w:r>
+    </w:p>
+    <w:p>
+      <w:pPr>
+        <w:tabs>
+          <w:tab w:val="left" w:pos="2518"/>
+        </w:tabs>
+      </w:pPr>
+      <w:r>
+        <w:t>--</w:t>
+      </w:r>
+    </w:p>
+    <w:p>
+      <w:pPr>
+        <w:tabs>
+          <w:tab w:val="left" w:pos="2518"/>
+        </w:tabs>
+      </w:pPr>
+      <w:r>
+        <w:rPr>
+          <w:noProof/>
+        </w:rPr>
+        <w:lastRenderedPageBreak/>
+        <mc:AlternateContent>
+          <mc:Choice Requires="wps">
+            <w:drawing>
+              <wp:anchor distT="45720" distB="45720" distL="114300" distR="114300" simplePos="0" relativeHeight="251670528" behindDoc="0" locked="0" layoutInCell="1" allowOverlap="1" wp14:anchorId="238B7A12" wp14:editId="32C73763">
+                <wp:simplePos x="0" y="0"/>
+                <wp:positionH relativeFrom="column">
+                  <wp:posOffset>1592564</wp:posOffset>
+                </wp:positionH>
+                <wp:positionV relativeFrom="paragraph">
+                  <wp:posOffset>239811</wp:posOffset>
+                </wp:positionV>
+                <wp:extent cx="2993390" cy="774065"/>
+                <wp:effectExtent l="0" t="0" r="16510" b="26035"/>
+                <wp:wrapTopAndBottom/>
+                <wp:docPr id="1083322701" name="Text Box 2"/>
+                <wp:cNvGraphicFramePr>
+                  <a:graphicFrameLocks xmlns:a="http://schemas.openxmlformats.org/drawingml/2006/main"/>
+                </wp:cNvGraphicFramePr>
+                <a:graphic xmlns:a="http://schemas.openxmlformats.org/drawingml/2006/main">
+                  <a:graphicData uri="http://schemas.microsoft.com/office/word/2010/wordprocessingShape">
+                    <wps:wsp>
+                      <wps:cNvSpPr txBox="1">
+                        <a:spLocks noChangeArrowheads="1"/>
+                      </wps:cNvSpPr>
+                      <wps:spPr bwMode="auto">
+                        <a:xfrm>
+                          <a:off x="0" y="0"/>
+                          <a:ext cx="2993390" cy="774065"/>
+                        </a:xfrm>
+                        <a:prstGeom prst="rect">
+                          <a:avLst/>
+                        </a:prstGeom>
+                        <a:solidFill>
+                          <a:srgbClr val="FFFFFF"/>
+                        </a:solidFill>
+                        <a:ln w="9525">
+                          <a:solidFill>
+                            <a:srgbClr val="000000"/>
+                          </a:solidFill>
+                          <a:miter lim="800000"/>
+                          <a:headEnd/>
+                          <a:tailEnd/>
+                        </a:ln>
+                      </wps:spPr>
+                      <wps:txbx>
+                        <w:txbxContent>
+                          <w:p>
+                            <w:r>
+                              <w:t>public void adjust(int amount) {</w:t>
+                            </w:r>
+                            <w:r>
+                              <w:br/>
+                              <w:t xml:space="preserve">    hp -= amount;</w:t>
+                            </w:r>
+                            <w:r>
+                              <w:br/>
+                              <w:t xml:space="preserve">    hp = Math.</w:t>
+                            </w:r>
+                            <w:r>
+                              <w:rPr>
+                                <w:i/>
+                                <w:iCs/>
+                              </w:rPr>
+                              <w:t>clamp</w:t>
+                            </w:r>
+                            <w:r>
+                              <w:t xml:space="preserve">(hp, 0, </w:t>
+                            </w:r>
+                            <w:r>
+                              <w:rPr>
+                                <w:i/>
+                                <w:iCs/>
+                              </w:rPr>
+                              <w:t>MAX_HP</w:t>
+                            </w:r>
+                            <w:r>
+                              <w:t>);</w:t>
+                            </w:r>
+                            <w:r>
+                              <w:br/>
+                              <w:t>}</w:t>
+                            </w:r>
+                          </w:p>
+                          <w:p/>
+                        </w:txbxContent>
+                      </wps:txbx>
+                      <wps:bodyPr rot="0" vert="horz" wrap="square" lIns="91440" tIns="45720" rIns="91440" bIns="45720" anchor="t" anchorCtr="0">
+                        <a:noAutofit/>
+                      </wps:bodyPr>
+                    </wps:wsp>
+                  </a:graphicData>
+                </a:graphic>
+                <wp14:sizeRelH relativeFrom="margin">
+                  <wp14:pctWidth>0</wp14:pctWidth>
+                </wp14:sizeRelH>
+                <wp14:sizeRelV relativeFrom="margin">
+                  <wp14:pctHeight>0</wp14:pctHeight>
+                </wp14:sizeRelV>
+              </wp:anchor>
+            </w:drawing>
+          </mc:Choice>
+          <mc:Fallback>
+            <w:pict>
+              <v:shape w14:anchorId="238B7A12" id="_x0000_s1030" type="#_x0000_t202" style="position:absolute;margin-left:125.4pt;margin-top:18.9pt;width:235.7pt;height:60.95pt;z-index:251670528;visibility:visible;mso-wrap-style:square;mso-width-percent:0;mso-height-percent:0;mso-wrap-distance-left:9pt;mso-wrap-distance-top:3.6pt;mso-wrap-distance-right:9pt;mso-wrap-distance-bottom:3.6pt;mso-position-horizontal:absolute;mso-position-horizontal-relative:text;mso-position-vertical:absolute;mso-position-vertical-relative:text;mso-width-percent:0;mso-height-percent:0;mso-width-relative:margin;mso-height-relative:margin;v-text-anchor:top" o:gfxdata="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">
+                <v:textbox>
+                  <w:txbxContent>
+                    <w:p>
+                      <w:r>
+                        <w:t>public void adjust(int amount) {</w:t>
+                      </w:r>
+                      <w:r>
+                        <w:br/>
+                        <w:t xml:space="preserve">    hp -= amount;</w:t>
+                      </w:r>
+                      <w:r>
+                        <w:br/>
+                        <w:t xml:space="preserve">    hp = Math.</w:t>
+                      </w:r>
+                      <w:r>
+                        <w:rPr>
+                          <w:i/>
+                          <w:iCs/>
+                        </w:rPr>
+                        <w:t>clamp</w:t>
+                      </w:r>
+                      <w:r>
+                        <w:t xml:space="preserve">(hp, 0, </w:t>
+                      </w:r>
+                      <w:r>
+                        <w:rPr>
+                          <w:i/>
+                          <w:iCs/>
+                        </w:rPr>
+                        <w:t>MAX_HP</w:t>
+                      </w:r>
+                      <w:r>
+                        <w:t>);</w:t>
+                      </w:r>
+                      <w:r>
+                        <w:br/>
+                        <w:t>}</w:t>
+                      </w:r>
+                    </w:p>
+                    <w:p/>
+                  </w:txbxContent>
+                </v:textbox>
+                <w10:wrap type="topAndBottom"/>
+              </v:shape>
+            </w:pict>
+          </mc:Fallback>
+        </mc:AlternateContent>
+      </w:r>
+      <w:r>
+        <w:t>3. adjust method is not descriptive enough, many variations of this in different classes.</w:t>
+      </w:r>
+    </w:p>
+    <w:p>
+      <w:pPr>
+        <w:tabs>
+          <w:tab w:val="left" w:pos="2518"/>
+        </w:tabs>
+      </w:pPr>
+      <w:r>
+        <w:rPr>
+          <w:noProof/>
+        </w:rPr>
+        <mc:AlternateContent>
+          <mc:Choice Requires="wps">
+            <w:drawing>
+              <wp:anchor distT="45720" distB="45720" distL="114300" distR="114300" simplePos="0" relativeHeight="251672576" behindDoc="0" locked="0" layoutInCell="1" allowOverlap="1" wp14:anchorId="1B83C309" wp14:editId="29E3840F">
+                <wp:simplePos x="0" y="0"/>
+                <wp:positionH relativeFrom="margin">
+                  <wp:posOffset>1579212</wp:posOffset>
+                </wp:positionH>
+                <wp:positionV relativeFrom="paragraph">
+                  <wp:posOffset>1262258</wp:posOffset>
+                </wp:positionV>
+                <wp:extent cx="2981960" cy="1404620"/>
+                <wp:effectExtent l="0" t="0" r="27940" b="27940"/>
+                <wp:wrapTopAndBottom/>
+                <wp:docPr id="1901684870" name="Text Box 2"/>
+                <wp:cNvGraphicFramePr>
+                  <a:graphicFrameLocks xmlns:a="http://schemas.openxmlformats.org/drawingml/2006/main"/>
+                </wp:cNvGraphicFramePr>
+                <a:graphic xmlns:a="http://schemas.openxmlformats.org/drawingml/2006/main">
+                  <a:graphicData uri="http://schemas.microsoft.com/office/word/2010/wordprocessingShape">
+                    <wps:wsp>
+                      <wps:cNvSpPr txBox="1">
+                        <a:spLocks noChangeArrowheads="1"/>
+                      </wps:cNvSpPr>
+                      <wps:spPr bwMode="auto">
+                        <a:xfrm>
+                          <a:off x="0" y="0"/>
+                          <a:ext cx="2981960" cy="1404620"/>
+                        </a:xfrm>
+                        <a:prstGeom prst="rect">
+                          <a:avLst/>
+                        </a:prstGeom>
+                        <a:solidFill>
+                          <a:srgbClr val="FFFFFF"/>
+                        </a:solidFill>
+                        <a:ln w="9525">
+                          <a:solidFill>
+                            <a:srgbClr val="000000"/>
+                          </a:solidFill>
+                          <a:miter lim="800000"/>
+                          <a:headEnd/>
+                          <a:tailEnd/>
+                        </a:ln>
+                      </wps:spPr>
+                      <wps:txbx>
+                        <w:txbxContent>
+                          <w:p>
+                            <w:r>
+                              <w:t>public void adjust(int amount) {</w:t>
+                            </w:r>
+                            <w:r>
+                              <w:br/>
+                              <w:t xml:space="preserve">    this.gainPower(amount);</w:t>
+                            </w:r>
+                            <w:r>
+                              <w:br/>
+                              <w:t>}</w:t>
+                            </w:r>
+                          </w:p>
+                        </w:txbxContent>
+                      </wps:txbx>
+                      <wps:bodyPr rot="0" vert="horz" wrap="square" lIns="91440" tIns="45720" rIns="91440" bIns="45720" anchor="t" anchorCtr="0">
+                        <a:spAutoFit/>
+                      </wps:bodyPr>
+                    </wps:wsp>
+                  </a:graphicData>
+                </a:graphic>
+                <wp14:sizeRelH relativeFrom="margin">
+                  <wp14:pctWidth>0</wp14:pctWidth>
+                </wp14:sizeRelH>
+                <wp14:sizeRelV relativeFrom="margin">
+                  <wp14:pctHeight>20000</wp14:pctHeight>
+                </wp14:sizeRelV>
+              </wp:anchor>
+            </w:drawing>
+          </mc:Choice>
+          <mc:Fallback>
+            <w:pict>
+              <v:shape w14:anchorId="1B83C309" id="_x0000_s1031" type="#_x0000_t202" style="position:absolute;margin-left:124.35pt;margin-top:99.4pt;width:234.8pt;height:110.6pt;z-index:251672576;visibility:visible;mso-wrap-style:square;mso-width-percent:0;mso-height-percent:200;mso-wrap-distance-left:9pt;mso-wrap-distance-top:3.6pt;mso-wrap-distance-right:9pt;mso-wrap-distance-bottom:3.6pt;mso-position-horizontal:absolute;mso-position-horizontal-relative:margin;mso-position-vertical:absolute;mso-position-vertical-relative:text;mso-width-percent:0;mso-height-percent:200;mso-width-relative:margin;mso-height-relative:margin;v-text-anchor:top" o:gfxdata="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">
+                <v:textbox style="mso-fit-shape-to-text:t">
+                  <w:txbxContent>
+                    <w:p>
+                      <w:r>
+                        <w:t>public void adjust(int amount) {</w:t>
+                      </w:r>
+                      <w:r>
+                        <w:br/>
+                        <w:t xml:space="preserve">    this.gainPower(amount);</w:t>
+                      </w:r>
+                      <w:r>
+                        <w:br/>
+                        <w:t>}</w:t>
+                      </w:r>
+                    </w:p>
+                  </w:txbxContent>
+                </v:textbox>
+                <w10:wrap type="topAndBottom" anchorx="margin"/>
+              </v:shape>
+            </w:pict>
+          </mc:Fallback>
+        </mc:AlternateContent>
+      </w:r>
+      <w:r>
+        <w:t>Above is playerManager’s adjust, which changes hp. Below is machinesManager’s adjust, which changes power instead.</w:t>
+      </w:r>
+    </w:p>
+    <w:p>
+      <w:pPr>
+        <w:tabs>
+          <w:tab w:val="left" w:pos="2518"/>
+        </w:tabs>
+      </w:pPr>
+      <w:r>
+        <w:t>A proposal would be to call them adjustHp and adjustPower; however refactoring playerManager is beyond scope of A2.</w:t>
       </w:r>
     </w:p>
     <w:p>
@@ -1581,7 +2376,7 @@
           </mc:Choice>
           <mc:Fallback>
             <w:pict>
-              <v:shape w14:anchorId="6EC99913" id="_x0000_s1028" type="#_x0000_t202" style="position:absolute;margin-left:0;margin-top:14.4pt;width:185.9pt;height:110.6pt;z-index:251659264;visibility:visible;mso-wrap-style:square;mso-width-percent:400;mso-height-percent:200;mso-wrap-distance-left:9pt;mso-wrap-distance-top:3.6pt;mso-wrap-distance-right:9pt;mso-wrap-distance-bottom:3.6pt;mso-position-horizontal:center;mso-position-horizontal-relative:text;mso-position-vertical:absolute;mso-position-vertical-relative:text;mso-width-percent:400;mso-height-percent:200;mso-width-relative:margin;mso-height-relative:margin;v-text-anchor:top" o:gfxdata="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">
+              <v:shape w14:anchorId="6EC99913" id="_x0000_s1032" type="#_x0000_t202" style="position:absolute;margin-left:0;margin-top:14.4pt;width:185.9pt;height:110.6pt;z-index:251659264;visibility:visible;mso-wrap-style:square;mso-width-percent:400;mso-height-percent:200;mso-wrap-distance-left:9pt;mso-wrap-distance-top:3.6pt;mso-wrap-distance-right:9pt;mso-wrap-distance-bottom:3.6pt;mso-position-horizontal:center;mso-position-horizontal-relative:text;mso-position-vertical:absolute;mso-position-vertical-relative:text;mso-width-percent:400;mso-height-percent:200;mso-width-relative:margin;mso-height-relative:margin;v-text-anchor:top" o:gfxdata="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">
                 <v:textbox style="mso-fit-shape-to-text:t">
                   <w:txbxContent>
                     <w:p>
@@ -1653,7 +2448,6 @@
         <w:pStyle w:val="Heading2"/>
       </w:pPr>
       <w:r>
-        <w:lastRenderedPageBreak/>
         <w:t>WeatherSpawnPoint</w:t>
       </w:r>
     </w:p>
@@ -1738,6 +2532,7 @@
     </w:p>
     <w:p>
       <w:r>
+        <w:lastRenderedPageBreak/>
         <w:t>Conveniently, this simplifies some code in WeatherSpawnPoint, e.g. directly access the point in getPosition</w:t>
       </w:r>
       <w:r>
@@ -1768,7 +2563,7 @@
                     <pic:cNvPicPr/>
                   </pic:nvPicPr>
                   <pic:blipFill>
-                    <a:blip r:embed="rId13"/>
+                    <a:blip r:embed="rId17"/>
                     <a:stretch>
                       <a:fillRect/>
                     </a:stretch>
@@ -1810,7 +2605,7 @@
                     <pic:cNvPicPr/>
                   </pic:nvPicPr>
                   <pic:blipFill>
-                    <a:blip r:embed="rId14"/>
+                    <a:blip r:embed="rId18"/>
                     <a:stretch>
                       <a:fillRect/>
                     </a:stretch>
@@ -1917,7 +2712,6 @@
         <w:rPr>
           <w:noProof/>
         </w:rPr>
-        <w:lastRenderedPageBreak/>
         <mc:AlternateContent>
           <mc:Choice Requires="wps">
             <w:drawing>
@@ -2028,7 +2822,7 @@
           </mc:Choice>
           <mc:Fallback>
             <w:pict>
-              <v:shape w14:anchorId="7AF5B014" id="_x0000_s1029" type="#_x0000_t202" style="position:absolute;margin-left:0;margin-top:14.4pt;width:185.9pt;height:110.6pt;z-index:251661312;visibility:visible;mso-wrap-style:square;mso-width-percent:400;mso-height-percent:200;mso-wrap-distance-left:9pt;mso-wrap-distance-top:3.6pt;mso-wrap-distance-right:9pt;mso-wrap-distance-bottom:3.6pt;mso-position-horizontal:center;mso-position-horizontal-relative:text;mso-position-vertical:absolute;mso-position-vertical-relative:text;mso-width-percent:400;mso-height-percent:200;mso-width-relative:margin;mso-height-relative:margin;v-text-anchor:top" o:gfxdata="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">
+              <v:shape w14:anchorId="7AF5B014" id="_x0000_s1033" type="#_x0000_t202" style="position:absolute;margin-left:0;margin-top:14.4pt;width:185.9pt;height:110.6pt;z-index:251661312;visibility:visible;mso-wrap-style:square;mso-width-percent:400;mso-height-percent:200;mso-wrap-distance-left:9pt;mso-wrap-distance-top:3.6pt;mso-wrap-distance-right:9pt;mso-wrap-distance-bottom:3.6pt;mso-position-horizontal:center;mso-position-horizontal-relative:text;mso-position-vertical:absolute;mso-position-vertical-relative:text;mso-width-percent:400;mso-height-percent:200;mso-width-relative:margin;mso-height-relative:margin;v-text-anchor:top" o:gfxdata="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">
                 <v:textbox style="mso-fit-shape-to-text:t">
                   <w:txbxContent>
                     <w:p>
@@ -2111,6 +2905,7 @@
           <w:bCs/>
           <w:lang w:val="en-US"/>
         </w:rPr>
+        <w:lastRenderedPageBreak/>
         <w:t>Defensive programming</w:t>
       </w:r>
       <w:r>
@@ -2164,7 +2959,7 @@
                     <pic:cNvPicPr/>
                   </pic:nvPicPr>
                   <pic:blipFill>
-                    <a:blip r:embed="rId15"/>
+                    <a:blip r:embed="rId19"/>
                     <a:stretch>
                       <a:fillRect/>
                     </a:stretch>
@@ -2187,6 +2982,27 @@
     </w:p>
     <w:p>
       <w:pPr>
+        <w:rPr>
+          <w:lang w:val="en-US"/>
+        </w:rPr>
+      </w:pPr>
+    </w:p>
+    <w:p>
+      <w:pPr>
+        <w:pStyle w:val="Heading3"/>
+        <w:rPr>
+          <w:lang w:val="en-US"/>
+        </w:rPr>
+      </w:pPr>
+      <w:r>
+        <w:rPr>
+          <w:lang w:val="en-US"/>
+        </w:rPr>
+        <w:t>Magic Numbers</w:t>
+      </w:r>
+    </w:p>
+    <w:p>
+      <w:pPr>
         <w:tabs>
           <w:tab w:val="left" w:pos="2518"/>
         </w:tabs>
@@ -2406,6 +3222,95 @@
     </w:lvl>
   </w:abstractNum>
   <w:abstractNum w:abstractNumId="2" w15:restartNumberingAfterBreak="0">
+    <w:nsid w:val="5CE9324C"/>
+    <w:multiLevelType w:val="hybridMultilevel"/>
+    <w:tmpl w:val="40C66122"/>
+    <w:lvl w:ilvl="0" w:tplc="0C09000F">
+      <w:start w:val="1"/>
+      <w:numFmt w:val="decimal"/>
+      <w:lvlText w:val="%1."/>
+      <w:lvlJc w:val="left"/>
+      <w:pPr>
+        <w:ind w:left="720" w:hanging="360"/>
+      </w:pPr>
+      <w:rPr>
+        <w:rFonts w:hint="default"/>
+      </w:rPr>
+    </w:lvl>
+    <w:lvl w:ilvl="1" w:tplc="0C090019" w:tentative="1">
+      <w:start w:val="1"/>
+      <w:numFmt w:val="lowerLetter"/>
+      <w:lvlText w:val="%2."/>
+      <w:lvlJc w:val="left"/>
+      <w:pPr>
+        <w:ind w:left="1440" w:hanging="360"/>
+      </w:pPr>
+    </w:lvl>
+    <w:lvl w:ilvl="2" w:tplc="0C09001B" w:tentative="1">
+      <w:start w:val="1"/>
+      <w:numFmt w:val="lowerRoman"/>
+      <w:lvlText w:val="%3."/>
+      <w:lvlJc w:val="right"/>
+      <w:pPr>
+        <w:ind w:left="2160" w:hanging="180"/>
+      </w:pPr>
+    </w:lvl>
+    <w:lvl w:ilvl="3" w:tplc="0C09000F" w:tentative="1">
+      <w:start w:val="1"/>
+      <w:numFmt w:val="decimal"/>
+      <w:lvlText w:val="%4."/>
+      <w:lvlJc w:val="left"/>
+      <w:pPr>
+        <w:ind w:left="2880" w:hanging="360"/>
+      </w:pPr>
+    </w:lvl>
+    <w:lvl w:ilvl="4" w:tplc="0C090019" w:tentative="1">
+      <w:start w:val="1"/>
+      <w:numFmt w:val="lowerLetter"/>
+      <w:lvlText w:val="%5."/>
+      <w:lvlJc w:val="left"/>
+      <w:pPr>
+        <w:ind w:left="3600" w:hanging="360"/>
+      </w:pPr>
+    </w:lvl>
+    <w:lvl w:ilvl="5" w:tplc="0C09001B" w:tentative="1">
+      <w:start w:val="1"/>
+      <w:numFmt w:val="lowerRoman"/>
+      <w:lvlText w:val="%6."/>
+      <w:lvlJc w:val="right"/>
+      <w:pPr>
+        <w:ind w:left="4320" w:hanging="180"/>
+      </w:pPr>
+    </w:lvl>
+    <w:lvl w:ilvl="6" w:tplc="0C09000F" w:tentative="1">
+      <w:start w:val="1"/>
+      <w:numFmt w:val="decimal"/>
+      <w:lvlText w:val="%7."/>
+      <w:lvlJc w:val="left"/>
+      <w:pPr>
+        <w:ind w:left="5040" w:hanging="360"/>
+      </w:pPr>
+    </w:lvl>
+    <w:lvl w:ilvl="7" w:tplc="0C090019" w:tentative="1">
+      <w:start w:val="1"/>
+      <w:numFmt w:val="lowerLetter"/>
+      <w:lvlText w:val="%8."/>
+      <w:lvlJc w:val="left"/>
+      <w:pPr>
+        <w:ind w:left="5760" w:hanging="360"/>
+      </w:pPr>
+    </w:lvl>
+    <w:lvl w:ilvl="8" w:tplc="0C09001B" w:tentative="1">
+      <w:start w:val="1"/>
+      <w:numFmt w:val="lowerRoman"/>
+      <w:lvlText w:val="%9."/>
+      <w:lvlJc w:val="right"/>
+      <w:pPr>
+        <w:ind w:left="6480" w:hanging="180"/>
+      </w:pPr>
+    </w:lvl>
+  </w:abstractNum>
+  <w:abstractNum w:abstractNumId="3" w15:restartNumberingAfterBreak="0">
     <w:nsid w:val="5F661799"/>
     <w:multiLevelType w:val="hybridMultilevel"/>
     <w:tmpl w:val="E7508938"/>
@@ -2494,7 +3399,7 @@
       </w:pPr>
     </w:lvl>
   </w:abstractNum>
-  <w:abstractNum w:abstractNumId="3" w15:restartNumberingAfterBreak="0">
+  <w:abstractNum w:abstractNumId="4" w15:restartNumberingAfterBreak="0">
     <w:nsid w:val="6A7601E3"/>
     <w:multiLevelType w:val="hybridMultilevel"/>
     <w:tmpl w:val="01AC63EC"/>
@@ -2583,7 +3488,7 @@
       </w:pPr>
     </w:lvl>
   </w:abstractNum>
-  <w:abstractNum w:abstractNumId="4" w15:restartNumberingAfterBreak="0">
+  <w:abstractNum w:abstractNumId="5" w15:restartNumberingAfterBreak="0">
     <w:nsid w:val="79A50148"/>
     <w:multiLevelType w:val="hybridMultilevel"/>
     <w:tmpl w:val="53C88D98"/>
@@ -2696,18 +3601,21 @@
     </w:lvl>
   </w:abstractNum>
   <w:num w:numId="1" w16cid:durableId="1837181672">
-    <w:abstractNumId w:val="4"/>
+    <w:abstractNumId w:val="5"/>
   </w:num>
   <w:num w:numId="2" w16cid:durableId="1100415117">
     <w:abstractNumId w:val="0"/>
   </w:num>
   <w:num w:numId="3" w16cid:durableId="1241016076">
-    <w:abstractNumId w:val="3"/>
+    <w:abstractNumId w:val="4"/>
   </w:num>
   <w:num w:numId="4" w16cid:durableId="636879476">
     <w:abstractNumId w:val="1"/>
   </w:num>
   <w:num w:numId="5" w16cid:durableId="759638401">
+    <w:abstractNumId w:val="3"/>
+  </w:num>
+  <w:num w:numId="6" w16cid:durableId="700663409">
     <w:abstractNumId w:val="2"/>
   </w:num>
 </w:numbering>
@@ -3185,7 +4093,6 @@
     <w:next w:val="Normal"/>
     <w:link w:val="Heading4Char"/>
     <w:uiPriority w:val="9"/>
-    <w:semiHidden/>
     <w:unhideWhenUsed/>
     <w:qFormat/>
     <w:rsid w:val="007120ED"/>
@@ -3381,7 +4288,6 @@
     <w:basedOn w:val="DefaultParagraphFont"/>
     <w:link w:val="Heading4"/>
     <w:uiPriority w:val="9"/>
-    <w:semiHidden/>
     <w:rsid w:val="007120ED"/>
     <w:rPr>
       <w:rFonts w:eastAsiaTheme="majorEastAsia" w:cstheme="majorBidi"/>

</xml_diff>

<commit_message>
added some javadocs, added tests to increase coverage of machinesManagerTest
</commit_message>
<xml_diff>
--- a/Justification.docx
+++ b/Justification.docx
@@ -46,9 +46,7 @@
     </w:p>
     <w:p>
       <w:pPr>
-        <w:rPr>
-          <w:lang w:val="en-US"/>
-        </w:rPr>
+        <w:keepNext/>
       </w:pPr>
       <w:r>
         <w:rPr>
@@ -163,6 +161,7 @@
       </w:r>
       <w:r>
         <w:rPr>
+          <w:noProof/>
           <w:lang w:val="en-US"/>
         </w:rPr>
         <w:drawing>
@@ -204,6 +203,41 @@
     </w:p>
     <w:p>
       <w:pPr>
+        <w:pStyle w:val="Caption"/>
+        <w:rPr>
+          <w:lang w:val="en-US"/>
+        </w:rPr>
+      </w:pPr>
+      <w:r>
+        <w:t xml:space="preserve">Figure </w:t>
+      </w:r>
+      <w:r>
+        <w:fldChar w:fldCharType="begin"/>
+      </w:r>
+      <w:r>
+        <w:instrText xml:space="preserve"> SEQ Figure \* ARABIC </w:instrText>
+      </w:r>
+      <w:r>
+        <w:fldChar w:fldCharType="separate"/>
+      </w:r>
+      <w:r>
+        <w:rPr>
+          <w:noProof/>
+        </w:rPr>
+        <w:t>1</w:t>
+      </w:r>
+      <w:r>
+        <w:fldChar w:fldCharType="end"/>
+      </w:r>
+      <w:r>
+        <w:t>. Low Cohesion vs High Cohesion</w:t>
+      </w:r>
+      <w:r>
+        <w:t xml:space="preserve"> Concept Diagram</w:t>
+      </w:r>
+    </w:p>
+    <w:p>
+      <w:pPr>
         <w:rPr>
           <w:lang w:val="en-US"/>
         </w:rPr>
@@ -391,13 +425,7 @@
         <w:rPr>
           <w:lang w:val="en-US"/>
         </w:rPr>
-        <w:t xml:space="preserve">LightningManager: </w:t>
-      </w:r>
-      <w:r>
-        <w:rPr>
-          <w:lang w:val="en-US"/>
-        </w:rPr>
-        <w:t>only handle attractLightning</w:t>
+        <w:t>LightningManager: only handle attractLightning</w:t>
       </w:r>
     </w:p>
     <w:p>
@@ -463,6 +491,27 @@
           <w:lang w:val="en-US"/>
         </w:rPr>
         <w:t>--</w:t>
+      </w:r>
+    </w:p>
+    <w:p>
+      <w:pPr>
+        <w:pStyle w:val="Heading3"/>
+      </w:pPr>
+      <w:r>
+        <w:rPr>
+          <w:b/>
+          <w:bCs/>
+          <w:lang w:val="en-US"/>
+        </w:rPr>
+        <w:t>Open/closed principle</w:t>
+      </w:r>
+      <w:r>
+        <w:rPr>
+          <w:b/>
+          <w:bCs/>
+          <w:lang w:val="en-US"/>
+        </w:rPr>
+        <w:t xml:space="preserve"> (O in SOLID)</w:t>
       </w:r>
     </w:p>
     <w:p>
@@ -502,11 +551,17 @@
       </w:r>
     </w:p>
     <w:p>
-      <w:r>
+      <w:pPr>
+        <w:keepNext/>
+      </w:pPr>
+      <w:r>
+        <w:rPr>
+          <w:noProof/>
+        </w:rPr>
         <w:drawing>
-          <wp:inline distT="0" distB="0" distL="0" distR="0" wp14:anchorId="3C8B0142" wp14:editId="1113B7C3">
-            <wp:extent cx="5731510" cy="2800985"/>
-            <wp:effectExtent l="0" t="0" r="2540" b="0"/>
+          <wp:inline distT="0" distB="0" distL="0" distR="0" wp14:anchorId="3C8B0142" wp14:editId="50E70013">
+            <wp:extent cx="4672940" cy="2283663"/>
+            <wp:effectExtent l="0" t="0" r="0" b="2540"/>
             <wp:docPr id="1509075614" name="Picture 1"/>
             <wp:cNvGraphicFramePr>
               <a:graphicFrameLocks xmlns:a="http://schemas.openxmlformats.org/drawingml/2006/main" noChangeAspect="1"/>
@@ -527,7 +582,7 @@
                   <pic:spPr>
                     <a:xfrm>
                       <a:off x="0" y="0"/>
-                      <a:ext cx="5731510" cy="2800985"/>
+                      <a:ext cx="4681365" cy="2287780"/>
                     </a:xfrm>
                     <a:prstGeom prst="rect">
                       <a:avLst/>
@@ -541,6 +596,35 @@
       </w:r>
     </w:p>
     <w:p>
+      <w:pPr>
+        <w:pStyle w:val="Caption"/>
+      </w:pPr>
+      <w:r>
+        <w:t xml:space="preserve">Figure </w:t>
+      </w:r>
+      <w:r>
+        <w:fldChar w:fldCharType="begin"/>
+      </w:r>
+      <w:r>
+        <w:instrText xml:space="preserve"> SEQ Figure \* ARABIC </w:instrText>
+      </w:r>
+      <w:r>
+        <w:fldChar w:fldCharType="separate"/>
+      </w:r>
+      <w:r>
+        <w:rPr>
+          <w:noProof/>
+        </w:rPr>
+        <w:t>2</w:t>
+      </w:r>
+      <w:r>
+        <w:fldChar w:fldCharType="end"/>
+      </w:r>
+      <w:r>
+        <w:t>. Original method before refactors</w:t>
+      </w:r>
+    </w:p>
+    <w:p>
       <w:r>
         <w:rPr>
           <w:lang w:val="en-US"/>
@@ -560,12 +644,11 @@
     </w:p>
     <w:p>
       <w:pPr>
-        <w:rPr>
-          <w:lang w:val="en-US"/>
-        </w:rPr>
-      </w:pPr>
-      <w:r>
-        <w:rPr>
+        <w:keepNext/>
+      </w:pPr>
+      <w:r>
+        <w:rPr>
+          <w:noProof/>
           <w:lang w:val="en-US"/>
         </w:rPr>
         <w:drawing>
@@ -607,6 +690,38 @@
     </w:p>
     <w:p>
       <w:pPr>
+        <w:pStyle w:val="Caption"/>
+        <w:rPr>
+          <w:lang w:val="en-US"/>
+        </w:rPr>
+      </w:pPr>
+      <w:r>
+        <w:t xml:space="preserve">Figure </w:t>
+      </w:r>
+      <w:r>
+        <w:fldChar w:fldCharType="begin"/>
+      </w:r>
+      <w:r>
+        <w:instrText xml:space="preserve"> SEQ Figure \* ARABIC </w:instrText>
+      </w:r>
+      <w:r>
+        <w:fldChar w:fldCharType="separate"/>
+      </w:r>
+      <w:r>
+        <w:rPr>
+          <w:noProof/>
+        </w:rPr>
+        <w:t>3</w:t>
+      </w:r>
+      <w:r>
+        <w:fldChar w:fldCharType="end"/>
+      </w:r>
+      <w:r>
+        <w:t>. Attractable class created and used</w:t>
+      </w:r>
+    </w:p>
+    <w:p>
+      <w:pPr>
         <w:rPr>
           <w:lang w:val="en-US"/>
         </w:rPr>
@@ -653,9 +768,21 @@
     </w:p>
     <w:p>
       <w:pPr>
-        <w:rPr>
-          <w:lang w:val="en-US"/>
-        </w:rPr>
+        <w:pStyle w:val="Heading3"/>
+        <w:rPr>
+          <w:lang w:val="en-US"/>
+        </w:rPr>
+      </w:pPr>
+      <w:r>
+        <w:rPr>
+          <w:lang w:val="en-US"/>
+        </w:rPr>
+        <w:t>Tight Coupling</w:t>
+      </w:r>
+    </w:p>
+    <w:p>
+      <w:pPr>
+        <w:keepNext/>
       </w:pPr>
       <w:r>
         <w:rPr>
@@ -766,6 +893,7 @@
       </w:r>
       <w:r>
         <w:rPr>
+          <w:noProof/>
           <w:lang w:val="en-US"/>
         </w:rPr>
         <w:drawing>
@@ -807,6 +935,41 @@
     </w:p>
     <w:p>
       <w:pPr>
+        <w:pStyle w:val="Caption"/>
+        <w:rPr>
+          <w:lang w:val="en-US"/>
+        </w:rPr>
+      </w:pPr>
+      <w:r>
+        <w:t xml:space="preserve">Figure </w:t>
+      </w:r>
+      <w:r>
+        <w:fldChar w:fldCharType="begin"/>
+      </w:r>
+      <w:r>
+        <w:instrText xml:space="preserve"> SEQ Figure \* ARABIC </w:instrText>
+      </w:r>
+      <w:r>
+        <w:fldChar w:fldCharType="separate"/>
+      </w:r>
+      <w:r>
+        <w:rPr>
+          <w:noProof/>
+        </w:rPr>
+        <w:t>4</w:t>
+      </w:r>
+      <w:r>
+        <w:fldChar w:fldCharType="end"/>
+      </w:r>
+      <w:r>
+        <w:t>. High Coupling</w:t>
+      </w:r>
+      <w:r>
+        <w:t xml:space="preserve"> Concept Diagram</w:t>
+      </w:r>
+    </w:p>
+    <w:p>
+      <w:pPr>
         <w:rPr>
           <w:lang w:val="en-US"/>
         </w:rPr>
@@ -846,9 +1009,7 @@
     </w:p>
     <w:p>
       <w:pPr>
-        <w:rPr>
-          <w:lang w:val="en-US"/>
-        </w:rPr>
+        <w:keepNext/>
       </w:pPr>
       <w:r>
         <w:rPr>
@@ -889,7 +1050,7 @@
           </mc:Choice>
           <mc:Fallback>
             <w:pict>
-              <v:shapetype w14:anchorId="0C7199EF" id="_x0000_t75" coordsize="21600,21600" o:spt="75" o:preferrelative="t" path="m@4@5l@4@11@9@11@9@5xe" filled="f" stroked="f">
+              <v:shapetype w14:anchorId="364C78EF" id="_x0000_t75" coordsize="21600,21600" o:spt="75" o:preferrelative="t" path="m@4@5l@4@11@9@11@9@5xe" filled="f" stroked="f">
                 <v:stroke joinstyle="miter"/>
                 <v:formulas>
                   <v:f eqn="if lineDrawn pixelLineWidth 0"/>
@@ -916,6 +1077,9 @@
         </mc:AlternateContent>
       </w:r>
       <w:r>
+        <w:rPr>
+          <w:noProof/>
+        </w:rPr>
         <w:drawing>
           <wp:inline distT="0" distB="0" distL="0" distR="0" wp14:anchorId="555F6C4C" wp14:editId="48CA73E7">
             <wp:extent cx="5731510" cy="2800985"/>
@@ -955,6 +1119,64 @@
     </w:p>
     <w:p>
       <w:pPr>
+        <w:pStyle w:val="Caption"/>
+        <w:rPr>
+          <w:lang w:val="en-US"/>
+        </w:rPr>
+      </w:pPr>
+      <w:r>
+        <w:t xml:space="preserve">Figure </w:t>
+      </w:r>
+      <w:r>
+        <w:fldChar w:fldCharType="begin"/>
+      </w:r>
+      <w:r>
+        <w:instrText xml:space="preserve"> SEQ Figure \* ARABIC </w:instrText>
+      </w:r>
+      <w:r>
+        <w:fldChar w:fldCharType="separate"/>
+      </w:r>
+      <w:r>
+        <w:rPr>
+          <w:noProof/>
+        </w:rPr>
+        <w:t>5</w:t>
+      </w:r>
+      <w:r>
+        <w:fldChar w:fldCharType="end"/>
+      </w:r>
+      <w:r>
+        <w:t>. identified Feature Envy</w:t>
+      </w:r>
+      <w:r>
+        <w:rPr>
+          <w:noProof/>
+        </w:rPr>
+        <w:t xml:space="preserve"> on Lightning</w:t>
+      </w:r>
+    </w:p>
+    <w:p>
+      <w:pPr>
+        <w:pStyle w:val="Heading3"/>
+        <w:rPr>
+          <w:lang w:val="en-US"/>
+        </w:rPr>
+      </w:pPr>
+      <w:r>
+        <w:rPr>
+          <w:lang w:val="en-US"/>
+        </w:rPr>
+        <w:t>Feature Envy</w:t>
+      </w:r>
+      <w:r>
+        <w:rPr>
+          <w:lang w:val="en-US"/>
+        </w:rPr>
+        <w:t xml:space="preserve"> (Code smell)</w:t>
+      </w:r>
+    </w:p>
+    <w:p>
+      <w:pPr>
         <w:rPr>
           <w:lang w:val="en-US"/>
         </w:rPr>
@@ -974,12 +1196,11 @@
     </w:p>
     <w:p>
       <w:pPr>
-        <w:rPr>
-          <w:lang w:val="en-US"/>
-        </w:rPr>
-      </w:pPr>
-      <w:r>
-        <w:rPr>
+        <w:keepNext/>
+      </w:pPr>
+      <w:r>
+        <w:rPr>
+          <w:noProof/>
           <w:lang w:val="en-US"/>
         </w:rPr>
         <w:drawing>
@@ -1021,18 +1242,50 @@
     </w:p>
     <w:p>
       <w:pPr>
-        <w:rPr>
-          <w:lang w:val="en-US"/>
-        </w:rPr>
-      </w:pPr>
-      <w:r>
-        <w:rPr>
-          <w:lang w:val="en-US"/>
-        </w:rPr>
+        <w:pStyle w:val="Caption"/>
+        <w:rPr>
+          <w:lang w:val="en-US"/>
+        </w:rPr>
+      </w:pPr>
+      <w:r>
+        <w:t xml:space="preserve">Figure </w:t>
+      </w:r>
+      <w:r>
+        <w:fldChar w:fldCharType="begin"/>
+      </w:r>
+      <w:r>
+        <w:instrText xml:space="preserve"> SEQ Figure \* ARABIC </w:instrText>
+      </w:r>
+      <w:r>
+        <w:fldChar w:fldCharType="separate"/>
+      </w:r>
+      <w:r>
+        <w:rPr>
+          <w:noProof/>
+        </w:rPr>
+        <w:t>6</w:t>
+      </w:r>
+      <w:r>
+        <w:fldChar w:fldCharType="end"/>
+      </w:r>
+      <w:r>
+        <w:t>. Attractable interface</w:t>
+      </w:r>
+    </w:p>
+    <w:p>
+      <w:pPr>
+        <w:keepNext/>
+      </w:pPr>
+      <w:r>
+        <w:rPr>
+          <w:lang w:val="en-US"/>
+        </w:rPr>
+        <w:lastRenderedPageBreak/>
         <w:t>Implementation moved to Lightning’s attractTo:</w:t>
       </w:r>
       <w:r>
         <w:rPr>
+          <w:noProof/>
           <w:lang w:val="en-US"/>
         </w:rPr>
         <w:drawing>
@@ -1074,26 +1327,56 @@
     </w:p>
     <w:p>
       <w:pPr>
-        <w:rPr>
-          <w:lang w:val="en-US"/>
-        </w:rPr>
-      </w:pPr>
-      <w:r>
-        <w:rPr>
-          <w:lang w:val="en-US"/>
-        </w:rPr>
-        <w:lastRenderedPageBreak/>
+        <w:pStyle w:val="Caption"/>
+        <w:rPr>
+          <w:lang w:val="en-US"/>
+        </w:rPr>
+      </w:pPr>
+      <w:r>
+        <w:t xml:space="preserve">Figure </w:t>
+      </w:r>
+      <w:r>
+        <w:fldChar w:fldCharType="begin"/>
+      </w:r>
+      <w:r>
+        <w:instrText xml:space="preserve"> SEQ Figure \* ARABIC </w:instrText>
+      </w:r>
+      <w:r>
+        <w:fldChar w:fldCharType="separate"/>
+      </w:r>
+      <w:r>
+        <w:rPr>
+          <w:noProof/>
+        </w:rPr>
+        <w:t>7</w:t>
+      </w:r>
+      <w:r>
+        <w:fldChar w:fldCharType="end"/>
+      </w:r>
+      <w:r>
+        <w:t>. moved Feature Envy part to Lightning itself</w:t>
+      </w:r>
+    </w:p>
+    <w:p>
+      <w:pPr>
+        <w:rPr>
+          <w:lang w:val="en-US"/>
+        </w:rPr>
+      </w:pPr>
+      <w:r>
+        <w:rPr>
+          <w:lang w:val="en-US"/>
+        </w:rPr>
         <w:t>Now the LightningManager is adapted to:</w:t>
       </w:r>
     </w:p>
     <w:p>
       <w:pPr>
-        <w:rPr>
-          <w:lang w:val="en-US"/>
-        </w:rPr>
-      </w:pPr>
-      <w:r>
-        <w:rPr>
+        <w:keepNext/>
+      </w:pPr>
+      <w:r>
+        <w:rPr>
+          <w:noProof/>
           <w:lang w:val="en-US"/>
         </w:rPr>
         <w:drawing>
@@ -1135,16 +1418,39 @@
     </w:p>
     <w:p>
       <w:pPr>
-        <w:rPr>
-          <w:lang w:val="en-US"/>
-        </w:rPr>
-      </w:pPr>
-    </w:p>
-    <w:p>
-      <w:pPr>
-        <w:rPr>
-          <w:lang w:val="en-US"/>
-        </w:rPr>
+        <w:pStyle w:val="Caption"/>
+        <w:rPr>
+          <w:lang w:val="en-US"/>
+        </w:rPr>
+      </w:pPr>
+      <w:r>
+        <w:t xml:space="preserve">Figure </w:t>
+      </w:r>
+      <w:r>
+        <w:fldChar w:fldCharType="begin"/>
+      </w:r>
+      <w:r>
+        <w:instrText xml:space="preserve"> SEQ Figure \* ARABIC </w:instrText>
+      </w:r>
+      <w:r>
+        <w:fldChar w:fldCharType="separate"/>
+      </w:r>
+      <w:r>
+        <w:rPr>
+          <w:noProof/>
+        </w:rPr>
+        <w:t>8</w:t>
+      </w:r>
+      <w:r>
+        <w:fldChar w:fldCharType="end"/>
+      </w:r>
+      <w:r>
+        <w:t>. refactored LightningManager</w:t>
+      </w:r>
+    </w:p>
+    <w:p>
+      <w:pPr>
+        <w:keepNext/>
       </w:pPr>
       <w:r>
         <w:rPr>
@@ -1281,6 +1587,7 @@
       </w:r>
       <w:r>
         <w:rPr>
+          <w:noProof/>
           <w:lang w:val="en-US"/>
         </w:rPr>
         <w:drawing>
@@ -1322,6 +1629,152 @@
     </w:p>
     <w:p>
       <w:pPr>
+        <w:pStyle w:val="Caption"/>
+        <w:rPr>
+          <w:lang w:val="en-US"/>
+        </w:rPr>
+      </w:pPr>
+      <w:r>
+        <w:t xml:space="preserve">Figure </w:t>
+      </w:r>
+      <w:r>
+        <w:fldChar w:fldCharType="begin"/>
+      </w:r>
+      <w:r>
+        <w:instrText xml:space="preserve"> SEQ Figure \* ARABIC </w:instrText>
+      </w:r>
+      <w:r>
+        <w:fldChar w:fldCharType="separate"/>
+      </w:r>
+      <w:r>
+        <w:rPr>
+          <w:noProof/>
+        </w:rPr>
+        <w:t>9</w:t>
+      </w:r>
+      <w:r>
+        <w:fldChar w:fldCharType="end"/>
+      </w:r>
+      <w:r>
+        <w:t>. Low Coupling Concept Diagram</w:t>
+      </w:r>
+    </w:p>
+    <w:p>
+      <w:pPr>
+        <w:pStyle w:val="Heading3"/>
+        <w:rPr>
+          <w:lang w:val="en-US"/>
+        </w:rPr>
+      </w:pPr>
+      <w:r>
+        <w:rPr>
+          <w:lang w:val="en-US"/>
+        </w:rPr>
+        <w:lastRenderedPageBreak/>
+        <w:t>Design Flaw</w:t>
+      </w:r>
+      <w:r>
+        <w:rPr>
+          <w:lang w:val="en-US"/>
+        </w:rPr>
+        <w:t xml:space="preserve"> in Weather</w:t>
+      </w:r>
+      <w:r>
+        <w:rPr>
+          <w:lang w:val="en-US"/>
+        </w:rPr>
+        <w:t>: Interface Segregation Violation</w:t>
+      </w:r>
+    </w:p>
+    <w:p>
+      <w:r>
+        <w:rPr>
+          <w:lang w:val="en-US"/>
+        </w:rPr>
+        <w:t xml:space="preserve">Weather extends </w:t>
+      </w:r>
+      <w:r>
+        <w:rPr>
+          <w:b/>
+          <w:bCs/>
+          <w:lang w:val="en-US"/>
+        </w:rPr>
+        <w:t>Damaging</w:t>
+      </w:r>
+      <w:r>
+        <w:rPr>
+          <w:lang w:val="en-US"/>
+        </w:rPr>
+        <w:t xml:space="preserve">, forcing </w:t>
+      </w:r>
+      <w:r>
+        <w:rPr>
+          <w:i/>
+          <w:iCs/>
+          <w:lang w:val="en-US"/>
+        </w:rPr>
+        <w:t>all</w:t>
+      </w:r>
+      <w:r>
+        <w:rPr>
+          <w:lang w:val="en-US"/>
+        </w:rPr>
+        <w:t xml:space="preserve"> weather to be damaging. This means </w:t>
+      </w:r>
+      <w:r>
+        <w:t> </w:t>
+      </w:r>
+      <w:r>
+        <w:rPr>
+          <w:b/>
+          <w:bCs/>
+        </w:rPr>
+        <w:t>every</w:t>
+      </w:r>
+      <w:r>
+        <w:t> class that implements Weather (like WeatherManager) must also implement Damaging, which requires getDamage() methods.</w:t>
+      </w:r>
+    </w:p>
+    <w:p>
+      <w:r>
+        <w:t>But Cloud (which implements Obscuring) is not damaging. Yet WeatherManager must still provide getDamage() methods that return null</w:t>
+      </w:r>
+      <w:r>
+        <w:t xml:space="preserve">. This is awkward and violates the interface segregation violation. </w:t>
+      </w:r>
+    </w:p>
+    <w:p>
+      <w:r>
+        <w:t>A fix is to create a new interface, Damager, which handles isDamaging and getDamage. Then we make Weather extend Damager so that weather can be a damager, but doesn’t have to be.</w:t>
+      </w:r>
+      <w:r>
+        <w:t xml:space="preserve"> However, since Weather interface cannot be changed as it will interfere with existing tests to pass, this specific refactor is only</w:t>
+      </w:r>
+      <w:r>
+        <w:t xml:space="preserve"> documented</w:t>
+      </w:r>
+      <w:r>
+        <w:t>.</w:t>
+      </w:r>
+    </w:p>
+    <w:p>
+      <w:pPr>
+        <w:pStyle w:val="Heading2"/>
+      </w:pPr>
+      <w:r>
+        <w:t>Unused Cleaning Interface</w:t>
+      </w:r>
+      <w:r>
+        <w:t xml:space="preserve"> - removed</w:t>
+      </w:r>
+    </w:p>
+    <w:p>
+      <w:r>
+        <w:t>In the provided code, Cleaning interface has no methods or javadocs, with no clear intention on how it’s to be used. There are also no tests running on it, so this class has been removed.</w:t>
+      </w:r>
+    </w:p>
+    <w:p>
+      <w:pPr>
         <w:pStyle w:val="Heading2"/>
         <w:rPr>
           <w:lang w:val="en-US"/>
@@ -1585,38 +2038,41 @@
         <w:pStyle w:val="Heading3"/>
       </w:pPr>
       <w:r>
+        <w:t>Code smells</w:t>
+      </w:r>
+    </w:p>
+    <w:p>
+      <w:pPr>
+        <w:pStyle w:val="Heading4"/>
+      </w:pPr>
+      <w:r>
+        <w:t>Inconsistent Logic</w:t>
+      </w:r>
+    </w:p>
+    <w:p>
+      <w:r>
+        <w:t>Cloud.java used to have a fixed implementation that freezes cloud movement once it reaches boundary, which neither RainCloud nor AcidCloud do. Hence, upon refactoring all clouds are removed cleanly once they’ve moved across the screen.</w:t>
+      </w:r>
+    </w:p>
+    <w:p>
+      <w:pPr>
+        <w:pStyle w:val="Heading4"/>
+      </w:pPr>
+      <w:r>
+        <w:t>Duplication</w:t>
+      </w:r>
+    </w:p>
+    <w:p>
+      <w:r>
+        <w:t xml:space="preserve">Boundary checking before marking for removal is duplicated in every cloud class. This is bad, because fixing one means fixing all. Hence, it was moved to the Cloudable mother class and now occurs just once and for all. </w:t>
+      </w:r>
+    </w:p>
+    <w:p>
+      <w:r>
+        <w:rPr>
+          <w:noProof/>
+        </w:rPr>
         <w:lastRenderedPageBreak/>
-        <w:t>Code smells</w:t>
-      </w:r>
-    </w:p>
-    <w:p>
-      <w:pPr>
-        <w:pStyle w:val="Heading4"/>
-      </w:pPr>
-      <w:r>
-        <w:t>Inconsistent Logic</w:t>
-      </w:r>
-    </w:p>
-    <w:p>
-      <w:r>
-        <w:t>Cloud.java used to have a fixed implementation that freezes cloud movement once it reaches boundary, which neither RainCloud nor AcidCloud do. Hence, upon refactoring all clouds are removed cleanly once they’ve moved across the screen.</w:t>
-      </w:r>
-    </w:p>
-    <w:p>
-      <w:pPr>
-        <w:pStyle w:val="Heading4"/>
-      </w:pPr>
-      <w:r>
-        <w:t>Duplication</w:t>
-      </w:r>
-    </w:p>
-    <w:p>
-      <w:r>
-        <w:t xml:space="preserve">Boundary checking before marking for removal is duplicated in every cloud class. This is bad, because fixing one means fixing all. Hence, it was moved to the Cloudable mother class and now occurs just once and for all. </w:t>
-      </w:r>
-    </w:p>
-    <w:p>
-      <w:r>
         <w:drawing>
           <wp:inline distT="0" distB="0" distL="0" distR="0" wp14:anchorId="21AE251D" wp14:editId="11ED2A7A">
             <wp:extent cx="6645910" cy="1880235"/>
@@ -1775,7 +2231,7 @@
         <w:pStyle w:val="ListParagraph"/>
         <w:numPr>
           <w:ilvl w:val="0"/>
-          <w:numId w:val="6"/>
+          <w:numId w:val="8"/>
         </w:numPr>
         <w:tabs>
           <w:tab w:val="left" w:pos="2518"/>
@@ -1800,6 +2256,7 @@
     </w:p>
     <w:p>
       <w:pPr>
+        <w:pStyle w:val="ListParagraph"/>
         <w:tabs>
           <w:tab w:val="left" w:pos="2518"/>
         </w:tabs>
@@ -1835,6 +2292,7 @@
     </w:p>
     <w:p>
       <w:pPr>
+        <w:pStyle w:val="ListParagraph"/>
         <w:tabs>
           <w:tab w:val="left" w:pos="2518"/>
         </w:tabs>
@@ -1860,44 +2318,31 @@
     </w:p>
     <w:p>
       <w:pPr>
+        <w:pStyle w:val="ListParagraph"/>
+        <w:numPr>
+          <w:ilvl w:val="0"/>
+          <w:numId w:val="8"/>
+        </w:numPr>
         <w:tabs>
           <w:tab w:val="left" w:pos="2518"/>
         </w:tabs>
       </w:pPr>
       <w:r>
-        <w:t>--</w:t>
-      </w:r>
-    </w:p>
-    <w:p>
-      <w:pPr>
-        <w:tabs>
-          <w:tab w:val="left" w:pos="2518"/>
-        </w:tabs>
-      </w:pPr>
-      <w:r>
-        <w:t xml:space="preserve">2. </w:t>
-      </w:r>
-      <w:r>
-        <w:t>Misleading method name</w:t>
-      </w:r>
-      <w:r>
-        <w:t>:</w:t>
-      </w:r>
-      <w:r>
-        <w:t xml:space="preserve"> setDamage suggets it stores some Damage object, but it only sets a boolean. A better name would be makeDamaged to meaningfully communicate the object getting this method will be damaged. However, this change cannot be done as the provided tests will not pass.</w:t>
-      </w:r>
-    </w:p>
-    <w:p>
-      <w:pPr>
-        <w:tabs>
-          <w:tab w:val="left" w:pos="2518"/>
-        </w:tabs>
-      </w:pPr>
-      <w:r>
+        <w:rPr>
+          <w:noProof/>
+        </w:rPr>
         <w:drawing>
-          <wp:inline distT="0" distB="0" distL="0" distR="0" wp14:anchorId="72A384F2" wp14:editId="1182A1E3">
-            <wp:extent cx="5259256" cy="1460290"/>
+          <wp:anchor distT="0" distB="0" distL="114300" distR="114300" simplePos="0" relativeHeight="251676672" behindDoc="1" locked="0" layoutInCell="1" allowOverlap="1" wp14:anchorId="72A384F2" wp14:editId="08F908F8">
+            <wp:simplePos x="0" y="0"/>
+            <wp:positionH relativeFrom="column">
+              <wp:posOffset>432880</wp:posOffset>
+            </wp:positionH>
+            <wp:positionV relativeFrom="paragraph">
+              <wp:posOffset>1002797</wp:posOffset>
+            </wp:positionV>
+            <wp:extent cx="5259070" cy="1459865"/>
             <wp:effectExtent l="0" t="0" r="0" b="6985"/>
+            <wp:wrapTopAndBottom/>
             <wp:docPr id="1337068179" name="Picture 1"/>
             <wp:cNvGraphicFramePr>
               <a:graphicFrameLocks xmlns:a="http://schemas.openxmlformats.org/drawingml/2006/main" noChangeAspect="1"/>
@@ -1910,7 +2355,13 @@
                     <pic:cNvPicPr/>
                   </pic:nvPicPr>
                   <pic:blipFill>
-                    <a:blip r:embed="rId16"/>
+                    <a:blip r:embed="rId16">
+                      <a:extLst>
+                        <a:ext uri="{28A0092B-C50C-407E-A947-70E740481C1C}">
+                          <a14:useLocalDpi xmlns:a14="http://schemas.microsoft.com/office/drawing/2010/main" val="0"/>
+                        </a:ext>
+                      </a:extLst>
+                    </a:blip>
                     <a:stretch>
                       <a:fillRect/>
                     </a:stretch>
@@ -1918,7 +2369,7 @@
                   <pic:spPr>
                     <a:xfrm>
                       <a:off x="0" y="0"/>
-                      <a:ext cx="5271840" cy="1463784"/>
+                      <a:ext cx="5259070" cy="1459865"/>
                     </a:xfrm>
                     <a:prstGeom prst="rect">
                       <a:avLst/>
@@ -1927,22 +2378,34 @@
                 </pic:pic>
               </a:graphicData>
             </a:graphic>
-          </wp:inline>
+          </wp:anchor>
         </w:drawing>
       </w:r>
-    </w:p>
-    <w:p>
-      <w:pPr>
+      <w:r>
+        <w:t>Misleading method name</w:t>
+      </w:r>
+      <w:r>
+        <w:t>:</w:t>
+      </w:r>
+      <w:r>
+        <w:t xml:space="preserve"> setDamage suggets it stores some Damage object, but it only sets a boolean. A better name would be makeDamaged to meaningfully communicate the object getting this method will be damaged. However, this change cannot be done as the provided tests will not pass.</w:t>
+      </w:r>
+    </w:p>
+    <w:p>
+      <w:pPr>
+        <w:pStyle w:val="ListParagraph"/>
         <w:tabs>
           <w:tab w:val="left" w:pos="2518"/>
         </w:tabs>
       </w:pPr>
-      <w:r>
-        <w:t>--</w:t>
-      </w:r>
-    </w:p>
-    <w:p>
-      <w:pPr>
+    </w:p>
+    <w:p>
+      <w:pPr>
+        <w:pStyle w:val="ListParagraph"/>
+        <w:numPr>
+          <w:ilvl w:val="0"/>
+          <w:numId w:val="8"/>
+        </w:numPr>
         <w:tabs>
           <w:tab w:val="left" w:pos="2518"/>
         </w:tabs>
@@ -1951,7 +2414,6 @@
         <w:rPr>
           <w:noProof/>
         </w:rPr>
-        <w:lastRenderedPageBreak/>
         <mc:AlternateContent>
           <mc:Choice Requires="wps">
             <w:drawing>
@@ -2055,7 +2517,7 @@
           </mc:Choice>
           <mc:Fallback>
             <w:pict>
-              <v:shape w14:anchorId="238B7A12" id="_x0000_s1030" type="#_x0000_t202" style="position:absolute;margin-left:125.4pt;margin-top:18.9pt;width:235.7pt;height:60.95pt;z-index:251670528;visibility:visible;mso-wrap-style:square;mso-width-percent:0;mso-height-percent:0;mso-wrap-distance-left:9pt;mso-wrap-distance-top:3.6pt;mso-wrap-distance-right:9pt;mso-wrap-distance-bottom:3.6pt;mso-position-horizontal:absolute;mso-position-horizontal-relative:text;mso-position-vertical:absolute;mso-position-vertical-relative:text;mso-width-percent:0;mso-height-percent:0;mso-width-relative:margin;mso-height-relative:margin;v-text-anchor:top" o:gfxdata="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">
+              <v:shape w14:anchorId="238B7A12" id="_x0000_s1030" type="#_x0000_t202" style="position:absolute;left:0;text-align:left;margin-left:125.4pt;margin-top:18.9pt;width:235.7pt;height:60.95pt;z-index:251670528;visibility:visible;mso-wrap-style:square;mso-width-percent:0;mso-height-percent:0;mso-wrap-distance-left:9pt;mso-wrap-distance-top:3.6pt;mso-wrap-distance-right:9pt;mso-wrap-distance-bottom:3.6pt;mso-position-horizontal:absolute;mso-position-horizontal-relative:text;mso-position-vertical:absolute;mso-position-vertical-relative:text;mso-width-percent:0;mso-height-percent:0;mso-width-relative:margin;mso-height-relative:margin;v-text-anchor:top" o:gfxdata="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">
                 <v:textbox>
                   <w:txbxContent>
                     <w:p>
@@ -2105,7 +2567,7 @@
         </mc:AlternateContent>
       </w:r>
       <w:r>
-        <w:t>3. adjust method is not descriptive enough, many variations of this in different classes.</w:t>
+        <w:t>adjust method is not descriptive enough, many variations of this in different classes.</w:t>
       </w:r>
     </w:p>
     <w:p>
@@ -2113,6 +2575,7 @@
         <w:tabs>
           <w:tab w:val="left" w:pos="2518"/>
         </w:tabs>
+        <w:ind w:left="360"/>
       </w:pPr>
       <w:r>
         <w:rPr>
@@ -2196,7 +2659,7 @@
           </mc:Choice>
           <mc:Fallback>
             <w:pict>
-              <v:shape w14:anchorId="1B83C309" id="_x0000_s1031" type="#_x0000_t202" style="position:absolute;margin-left:124.35pt;margin-top:99.4pt;width:234.8pt;height:110.6pt;z-index:251672576;visibility:visible;mso-wrap-style:square;mso-width-percent:0;mso-height-percent:200;mso-wrap-distance-left:9pt;mso-wrap-distance-top:3.6pt;mso-wrap-distance-right:9pt;mso-wrap-distance-bottom:3.6pt;mso-position-horizontal:absolute;mso-position-horizontal-relative:margin;mso-position-vertical:absolute;mso-position-vertical-relative:text;mso-width-percent:0;mso-height-percent:200;mso-width-relative:margin;mso-height-relative:margin;v-text-anchor:top" o:gfxdata="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">
+              <v:shape w14:anchorId="1B83C309" id="_x0000_s1031" type="#_x0000_t202" style="position:absolute;left:0;text-align:left;margin-left:124.35pt;margin-top:99.4pt;width:234.8pt;height:110.6pt;z-index:251672576;visibility:visible;mso-wrap-style:square;mso-width-percent:0;mso-height-percent:200;mso-wrap-distance-left:9pt;mso-wrap-distance-top:3.6pt;mso-wrap-distance-right:9pt;mso-wrap-distance-bottom:3.6pt;mso-position-horizontal:absolute;mso-position-horizontal-relative:margin;mso-position-vertical:absolute;mso-position-vertical-relative:text;mso-width-percent:0;mso-height-percent:200;mso-width-relative:margin;mso-height-relative:margin;v-text-anchor:top" o:gfxdata="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">
                 <v:textbox style="mso-fit-shape-to-text:t">
                   <w:txbxContent>
                     <w:p>
@@ -2229,8 +2692,10 @@
         <w:tabs>
           <w:tab w:val="left" w:pos="2518"/>
         </w:tabs>
-      </w:pPr>
-      <w:r>
+        <w:ind w:left="360"/>
+      </w:pPr>
+      <w:r>
+        <w:lastRenderedPageBreak/>
         <w:t>A proposal would be to call them adjustHp and adjustPower; however refactoring playerManager is beyond scope of A2.</w:t>
       </w:r>
     </w:p>
@@ -2264,7 +2729,19 @@
         <w:t xml:space="preserve">h instead of </w:t>
       </w:r>
       <w:r>
-        <w:t>modifying the existing if-else chain (adding 2 new branches).</w:t>
+        <w:t>modifying the existing if-else chain (</w:t>
+      </w:r>
+      <w:r>
+        <w:t>which added</w:t>
+      </w:r>
+      <w:r>
+        <w:t xml:space="preserve"> 2 branches</w:t>
+      </w:r>
+      <w:r>
+        <w:t xml:space="preserve"> when this could be done in 1 in the new implementation</w:t>
+      </w:r>
+      <w:r>
+        <w:t>).</w:t>
       </w:r>
     </w:p>
     <w:p>
@@ -2285,8 +2762,13 @@
     </w:p>
     <w:p>
       <w:r>
-        <w:t>Instead of repeating lowercase and uppercase cases for each letter, it was handled in one place.</w:t>
-      </w:r>
+        <w:t>Instead of repeating lowercase and uppercase cases for each letter, it was handled in one place</w:t>
+      </w:r>
+      <w:r>
+        <w:t xml:space="preserve"> using logic:</w:t>
+      </w:r>
+    </w:p>
+    <w:p>
       <w:r>
         <w:rPr>
           <w:noProof/>
@@ -2407,6 +2889,12 @@
           </mc:Fallback>
         </mc:AlternateContent>
       </w:r>
+      <w:r>
+        <w:t xml:space="preserve"> </w:t>
+      </w:r>
+      <w:r>
+        <w:t>With finalSpawnTime multiplied to each case’s spawning instead of a statically hardcoded number for each. This simplifies the reading, logic and reduces code duplication.</w:t>
+      </w:r>
     </w:p>
     <w:p>
       <w:pPr>
@@ -2532,7 +3020,6 @@
     </w:p>
     <w:p>
       <w:r>
-        <w:lastRenderedPageBreak/>
         <w:t>Conveniently, this simplifies some code in WeatherSpawnPoint, e.g. directly access the point in getPosition</w:t>
       </w:r>
       <w:r>
@@ -2589,6 +3076,7 @@
         <w:rPr>
           <w:noProof/>
         </w:rPr>
+        <w:lastRenderedPageBreak/>
         <w:drawing>
           <wp:inline distT="0" distB="0" distL="0" distR="0" wp14:anchorId="7DE3BE26" wp14:editId="3FF76637">
             <wp:extent cx="5731510" cy="1257935"/>
@@ -2694,13 +3182,6 @@
       <w:r>
         <w:t>, which can cause bugs.</w:t>
       </w:r>
-    </w:p>
-    <w:p>
-      <w:pPr>
-        <w:tabs>
-          <w:tab w:val="left" w:pos="2518"/>
-        </w:tabs>
-      </w:pPr>
     </w:p>
     <w:p>
       <w:pPr>
@@ -2881,20 +3362,6 @@
     </w:p>
     <w:p>
       <w:pPr>
-        <w:tabs>
-          <w:tab w:val="left" w:pos="2518"/>
-        </w:tabs>
-      </w:pPr>
-    </w:p>
-    <w:p>
-      <w:pPr>
-        <w:tabs>
-          <w:tab w:val="left" w:pos="2518"/>
-        </w:tabs>
-      </w:pPr>
-    </w:p>
-    <w:p>
-      <w:pPr>
         <w:rPr>
           <w:lang w:val="en-US"/>
         </w:rPr>
@@ -2905,44 +3372,45 @@
           <w:bCs/>
           <w:lang w:val="en-US"/>
         </w:rPr>
+        <w:t>Defensive programming</w:t>
+      </w:r>
+      <w:r>
+        <w:rPr>
+          <w:lang w:val="en-US"/>
+        </w:rPr>
+        <w:t xml:space="preserve">: instead of adding it to a final array list, </w:t>
+      </w:r>
+    </w:p>
+    <w:p>
+      <w:r>
+        <w:t xml:space="preserve">return </w:t>
+      </w:r>
+      <w:r>
+        <w:t>new</w:t>
+      </w:r>
+      <w:r>
+        <w:t xml:space="preserve"> ArrayList&lt;&gt;(phenomena);</w:t>
+      </w:r>
+    </w:p>
+    <w:p>
+      <w:pPr>
+        <w:rPr>
+          <w:lang w:val="en-US"/>
+        </w:rPr>
+      </w:pPr>
+    </w:p>
+    <w:p>
+      <w:pPr>
+        <w:rPr>
+          <w:lang w:val="en-US"/>
+        </w:rPr>
+      </w:pPr>
+      <w:r>
+        <w:rPr>
+          <w:noProof/>
+          <w:lang w:val="en-US"/>
+        </w:rPr>
         <w:lastRenderedPageBreak/>
-        <w:t>Defensive programming</w:t>
-      </w:r>
-      <w:r>
-        <w:rPr>
-          <w:lang w:val="en-US"/>
-        </w:rPr>
-        <w:t xml:space="preserve">: instead of adding it to a final array list, </w:t>
-      </w:r>
-    </w:p>
-    <w:p>
-      <w:r>
-        <w:t xml:space="preserve">return </w:t>
-      </w:r>
-      <w:r>
-        <w:t>new</w:t>
-      </w:r>
-      <w:r>
-        <w:t xml:space="preserve"> ArrayList&lt;&gt;(phenomena);</w:t>
-      </w:r>
-    </w:p>
-    <w:p>
-      <w:pPr>
-        <w:rPr>
-          <w:lang w:val="en-US"/>
-        </w:rPr>
-      </w:pPr>
-    </w:p>
-    <w:p>
-      <w:pPr>
-        <w:rPr>
-          <w:lang w:val="en-US"/>
-        </w:rPr>
-      </w:pPr>
-      <w:r>
-        <w:rPr>
-          <w:lang w:val="en-US"/>
-        </w:rPr>
         <w:drawing>
           <wp:inline distT="0" distB="0" distL="0" distR="0" wp14:anchorId="4BDCD5C9" wp14:editId="72024C4B">
             <wp:extent cx="5731510" cy="2249170"/>
@@ -2982,13 +3450,6 @@
     </w:p>
     <w:p>
       <w:pPr>
-        <w:rPr>
-          <w:lang w:val="en-US"/>
-        </w:rPr>
-      </w:pPr>
-    </w:p>
-    <w:p>
-      <w:pPr>
         <w:pStyle w:val="Heading3"/>
         <w:rPr>
           <w:lang w:val="en-US"/>
@@ -2999,6 +3460,98 @@
           <w:lang w:val="en-US"/>
         </w:rPr>
         <w:t>Magic Numbers</w:t>
+      </w:r>
+    </w:p>
+    <w:p>
+      <w:pPr>
+        <w:pStyle w:val="ListParagraph"/>
+        <w:numPr>
+          <w:ilvl w:val="0"/>
+          <w:numId w:val="7"/>
+        </w:numPr>
+      </w:pPr>
+      <w:r>
+        <w:t xml:space="preserve">In SpawnerFactory, the 5.5 appeared a catastrophic number of times, usually through the many </w:t>
+      </w:r>
+    </w:p>
+    <w:p>
+      <w:pPr>
+        <w:pStyle w:val="Quote"/>
+      </w:pPr>
+      <w:r>
+        <w:t>new RepeatingTimer((int) (Cloud.SPAWN_TIME * 5.5))</w:t>
+      </w:r>
+    </w:p>
+    <w:p>
+      <w:pPr>
+        <w:ind w:firstLine="720"/>
+      </w:pPr>
+      <w:r>
+        <w:t>in the massive if statements. This was reduced by adding the field:</w:t>
+      </w:r>
+    </w:p>
+    <w:p>
+      <w:r>
+        <w:rPr>
+          <w:noProof/>
+        </w:rPr>
+        <w:drawing>
+          <wp:anchor distT="0" distB="0" distL="114300" distR="114300" simplePos="0" relativeHeight="251675648" behindDoc="1" locked="0" layoutInCell="1" allowOverlap="1" wp14:anchorId="605998DB" wp14:editId="68A7952F">
+            <wp:simplePos x="0" y="0"/>
+            <wp:positionH relativeFrom="margin">
+              <wp:align>center</wp:align>
+            </wp:positionH>
+            <wp:positionV relativeFrom="paragraph">
+              <wp:posOffset>34310</wp:posOffset>
+            </wp:positionV>
+            <wp:extent cx="5440300" cy="1099392"/>
+            <wp:effectExtent l="0" t="0" r="8255" b="5715"/>
+            <wp:wrapTight wrapText="bothSides">
+              <wp:wrapPolygon edited="0">
+                <wp:start x="0" y="0"/>
+                <wp:lineTo x="0" y="21338"/>
+                <wp:lineTo x="21557" y="21338"/>
+                <wp:lineTo x="21557" y="0"/>
+                <wp:lineTo x="0" y="0"/>
+              </wp:wrapPolygon>
+            </wp:wrapTight>
+            <wp:docPr id="1731391528" name="Picture 1"/>
+            <wp:cNvGraphicFramePr>
+              <a:graphicFrameLocks xmlns:a="http://schemas.openxmlformats.org/drawingml/2006/main" noChangeAspect="1"/>
+            </wp:cNvGraphicFramePr>
+            <a:graphic xmlns:a="http://schemas.openxmlformats.org/drawingml/2006/main">
+              <a:graphicData uri="http://schemas.openxmlformats.org/drawingml/2006/picture">
+                <pic:pic xmlns:pic="http://schemas.openxmlformats.org/drawingml/2006/picture">
+                  <pic:nvPicPr>
+                    <pic:cNvPr id="1731391528" name=""/>
+                    <pic:cNvPicPr/>
+                  </pic:nvPicPr>
+                  <pic:blipFill>
+                    <a:blip r:embed="rId20">
+                      <a:extLst>
+                        <a:ext uri="{28A0092B-C50C-407E-A947-70E740481C1C}">
+                          <a14:useLocalDpi xmlns:a14="http://schemas.microsoft.com/office/drawing/2010/main" val="0"/>
+                        </a:ext>
+                      </a:extLst>
+                    </a:blip>
+                    <a:stretch>
+                      <a:fillRect/>
+                    </a:stretch>
+                  </pic:blipFill>
+                  <pic:spPr>
+                    <a:xfrm>
+                      <a:off x="0" y="0"/>
+                      <a:ext cx="5440300" cy="1099392"/>
+                    </a:xfrm>
+                    <a:prstGeom prst="rect">
+                      <a:avLst/>
+                    </a:prstGeom>
+                  </pic:spPr>
+                </pic:pic>
+              </a:graphicData>
+            </a:graphic>
+          </wp:anchor>
+        </w:drawing>
       </w:r>
     </w:p>
     <w:p>
@@ -3006,6 +3559,155 @@
         <w:tabs>
           <w:tab w:val="left" w:pos="2518"/>
         </w:tabs>
+      </w:pPr>
+    </w:p>
+    <w:p>
+      <w:pPr>
+        <w:tabs>
+          <w:tab w:val="left" w:pos="2518"/>
+        </w:tabs>
+      </w:pPr>
+    </w:p>
+    <w:p>
+      <w:pPr>
+        <w:tabs>
+          <w:tab w:val="left" w:pos="2518"/>
+        </w:tabs>
+      </w:pPr>
+    </w:p>
+    <w:p>
+      <w:pPr>
+        <w:tabs>
+          <w:tab w:val="left" w:pos="2518"/>
+        </w:tabs>
+      </w:pPr>
+    </w:p>
+    <w:p>
+      <w:pPr>
+        <w:pStyle w:val="ListParagraph"/>
+        <w:numPr>
+          <w:ilvl w:val="0"/>
+          <w:numId w:val="7"/>
+        </w:numPr>
+        <w:tabs>
+          <w:tab w:val="left" w:pos="2518"/>
+        </w:tabs>
+        <w:rPr>
+          <w:i/>
+          <w:iCs/>
+          <w:color w:val="404040" w:themeColor="text1" w:themeTint="BF"/>
+        </w:rPr>
+      </w:pPr>
+      <w:r>
+        <w:t xml:space="preserve">In Cloud.java, the 12: </w:t>
+      </w:r>
+    </w:p>
+    <w:p>
+      <w:pPr>
+        <w:pStyle w:val="Quote"/>
+        <w:rPr>
+          <w:rStyle w:val="QuoteChar"/>
+        </w:rPr>
+      </w:pPr>
+      <w:r>
+        <w:rPr>
+          <w:rStyle w:val="QuoteChar"/>
+        </w:rPr>
+        <w:t>private final TickTimer animTimer = new RepeatingTimer(12);</w:t>
+      </w:r>
+    </w:p>
+    <w:p>
+      <w:pPr>
+        <w:pStyle w:val="ListParagraph"/>
+        <w:tabs>
+          <w:tab w:val="left" w:pos="2518"/>
+        </w:tabs>
+      </w:pPr>
+      <w:r>
+        <w:t xml:space="preserve">Removed by adding field in Cloudable which got inherited by all clouds: </w:t>
+      </w:r>
+    </w:p>
+    <w:p>
+      <w:pPr>
+        <w:pStyle w:val="Quote"/>
+      </w:pPr>
+      <w:r>
+        <w:t>private static final int ANIMATION_INTERVAL = 12;</w:t>
+      </w:r>
+    </w:p>
+    <w:p>
+      <w:pPr>
+        <w:pStyle w:val="ListParagraph"/>
+        <w:numPr>
+          <w:ilvl w:val="0"/>
+          <w:numId w:val="7"/>
+        </w:numPr>
+        <w:tabs>
+          <w:tab w:val="left" w:pos="2518"/>
+        </w:tabs>
+      </w:pPr>
+      <w:r>
+        <w:t>In Lightning.java, the 5:</w:t>
+      </w:r>
+    </w:p>
+    <w:p>
+      <w:pPr>
+        <w:pStyle w:val="Quote"/>
+      </w:pPr>
+      <w:r>
+        <w:t xml:space="preserve"> </w:t>
+      </w:r>
+      <w:r>
+        <w:t>if (animFrame == 5 || animFrame == 6)</w:t>
+      </w:r>
+    </w:p>
+    <w:p>
+      <w:r>
+        <w:tab/>
+        <w:t xml:space="preserve">removed by adding </w:t>
+      </w:r>
+    </w:p>
+    <w:p>
+      <w:pPr>
+        <w:pStyle w:val="Quote"/>
+      </w:pPr>
+      <w:r>
+        <w:t>private static final int DAMAGE_FRAME_START = 5;</w:t>
+      </w:r>
+      <w:r>
+        <w:br/>
+        <w:t>private static final int DAMAGE_FRAME_END = 6;</w:t>
+      </w:r>
+    </w:p>
+    <w:p>
+      <w:pPr>
+        <w:ind w:left="720"/>
+        <w:rPr>
+          <w:i/>
+          <w:iCs/>
+          <w:color w:val="404040" w:themeColor="text1" w:themeTint="BF"/>
+        </w:rPr>
+      </w:pPr>
+      <w:r>
+        <w:rPr>
+          <w:color w:val="404040" w:themeColor="text1" w:themeTint="BF"/>
+        </w:rPr>
+        <w:t>so that code becomes:</w:t>
+      </w:r>
+      <w:r>
+        <w:rPr>
+          <w:i/>
+          <w:iCs/>
+          <w:color w:val="404040" w:themeColor="text1" w:themeTint="BF"/>
+        </w:rPr>
+        <w:br/>
+        <w:t>animFrame == DAMAGE_FRAME_START || animFrame == DAMAGE_FRAME_END;</w:t>
+      </w:r>
+    </w:p>
+    <w:p>
+      <w:pPr>
+        <w:pStyle w:val="Quote"/>
+        <w:jc w:val="left"/>
       </w:pPr>
     </w:p>
     <w:sectPr>
@@ -3110,6 +3812,95 @@
     </w:lvl>
   </w:abstractNum>
   <w:abstractNum w:abstractNumId="1" w15:restartNumberingAfterBreak="0">
+    <w:nsid w:val="227F156D"/>
+    <w:multiLevelType w:val="hybridMultilevel"/>
+    <w:tmpl w:val="214A9978"/>
+    <w:lvl w:ilvl="0" w:tplc="0C09000F">
+      <w:start w:val="1"/>
+      <w:numFmt w:val="decimal"/>
+      <w:lvlText w:val="%1."/>
+      <w:lvlJc w:val="left"/>
+      <w:pPr>
+        <w:ind w:left="720" w:hanging="360"/>
+      </w:pPr>
+      <w:rPr>
+        <w:rFonts w:hint="default"/>
+      </w:rPr>
+    </w:lvl>
+    <w:lvl w:ilvl="1" w:tplc="0C090019" w:tentative="1">
+      <w:start w:val="1"/>
+      <w:numFmt w:val="lowerLetter"/>
+      <w:lvlText w:val="%2."/>
+      <w:lvlJc w:val="left"/>
+      <w:pPr>
+        <w:ind w:left="1440" w:hanging="360"/>
+      </w:pPr>
+    </w:lvl>
+    <w:lvl w:ilvl="2" w:tplc="0C09001B" w:tentative="1">
+      <w:start w:val="1"/>
+      <w:numFmt w:val="lowerRoman"/>
+      <w:lvlText w:val="%3."/>
+      <w:lvlJc w:val="right"/>
+      <w:pPr>
+        <w:ind w:left="2160" w:hanging="180"/>
+      </w:pPr>
+    </w:lvl>
+    <w:lvl w:ilvl="3" w:tplc="0C09000F" w:tentative="1">
+      <w:start w:val="1"/>
+      <w:numFmt w:val="decimal"/>
+      <w:lvlText w:val="%4."/>
+      <w:lvlJc w:val="left"/>
+      <w:pPr>
+        <w:ind w:left="2880" w:hanging="360"/>
+      </w:pPr>
+    </w:lvl>
+    <w:lvl w:ilvl="4" w:tplc="0C090019" w:tentative="1">
+      <w:start w:val="1"/>
+      <w:numFmt w:val="lowerLetter"/>
+      <w:lvlText w:val="%5."/>
+      <w:lvlJc w:val="left"/>
+      <w:pPr>
+        <w:ind w:left="3600" w:hanging="360"/>
+      </w:pPr>
+    </w:lvl>
+    <w:lvl w:ilvl="5" w:tplc="0C09001B" w:tentative="1">
+      <w:start w:val="1"/>
+      <w:numFmt w:val="lowerRoman"/>
+      <w:lvlText w:val="%6."/>
+      <w:lvlJc w:val="right"/>
+      <w:pPr>
+        <w:ind w:left="4320" w:hanging="180"/>
+      </w:pPr>
+    </w:lvl>
+    <w:lvl w:ilvl="6" w:tplc="0C09000F" w:tentative="1">
+      <w:start w:val="1"/>
+      <w:numFmt w:val="decimal"/>
+      <w:lvlText w:val="%7."/>
+      <w:lvlJc w:val="left"/>
+      <w:pPr>
+        <w:ind w:left="5040" w:hanging="360"/>
+      </w:pPr>
+    </w:lvl>
+    <w:lvl w:ilvl="7" w:tplc="0C090019" w:tentative="1">
+      <w:start w:val="1"/>
+      <w:numFmt w:val="lowerLetter"/>
+      <w:lvlText w:val="%8."/>
+      <w:lvlJc w:val="left"/>
+      <w:pPr>
+        <w:ind w:left="5760" w:hanging="360"/>
+      </w:pPr>
+    </w:lvl>
+    <w:lvl w:ilvl="8" w:tplc="0C09001B" w:tentative="1">
+      <w:start w:val="1"/>
+      <w:numFmt w:val="lowerRoman"/>
+      <w:lvlText w:val="%9."/>
+      <w:lvlJc w:val="right"/>
+      <w:pPr>
+        <w:ind w:left="6480" w:hanging="180"/>
+      </w:pPr>
+    </w:lvl>
+  </w:abstractNum>
+  <w:abstractNum w:abstractNumId="2" w15:restartNumberingAfterBreak="0">
     <w:nsid w:val="46347B39"/>
     <w:multiLevelType w:val="hybridMultilevel"/>
     <w:tmpl w:val="5098708C"/>
@@ -3221,7 +4012,96 @@
       </w:rPr>
     </w:lvl>
   </w:abstractNum>
-  <w:abstractNum w:abstractNumId="2" w15:restartNumberingAfterBreak="0">
+  <w:abstractNum w:abstractNumId="3" w15:restartNumberingAfterBreak="0">
+    <w:nsid w:val="4E5C6A0D"/>
+    <w:multiLevelType w:val="hybridMultilevel"/>
+    <w:tmpl w:val="FC0AAF08"/>
+    <w:lvl w:ilvl="0" w:tplc="0C09000F">
+      <w:start w:val="1"/>
+      <w:numFmt w:val="decimal"/>
+      <w:lvlText w:val="%1."/>
+      <w:lvlJc w:val="left"/>
+      <w:pPr>
+        <w:ind w:left="720" w:hanging="360"/>
+      </w:pPr>
+      <w:rPr>
+        <w:rFonts w:hint="default"/>
+      </w:rPr>
+    </w:lvl>
+    <w:lvl w:ilvl="1" w:tplc="0C090019" w:tentative="1">
+      <w:start w:val="1"/>
+      <w:numFmt w:val="lowerLetter"/>
+      <w:lvlText w:val="%2."/>
+      <w:lvlJc w:val="left"/>
+      <w:pPr>
+        <w:ind w:left="1440" w:hanging="360"/>
+      </w:pPr>
+    </w:lvl>
+    <w:lvl w:ilvl="2" w:tplc="0C09001B" w:tentative="1">
+      <w:start w:val="1"/>
+      <w:numFmt w:val="lowerRoman"/>
+      <w:lvlText w:val="%3."/>
+      <w:lvlJc w:val="right"/>
+      <w:pPr>
+        <w:ind w:left="2160" w:hanging="180"/>
+      </w:pPr>
+    </w:lvl>
+    <w:lvl w:ilvl="3" w:tplc="0C09000F" w:tentative="1">
+      <w:start w:val="1"/>
+      <w:numFmt w:val="decimal"/>
+      <w:lvlText w:val="%4."/>
+      <w:lvlJc w:val="left"/>
+      <w:pPr>
+        <w:ind w:left="2880" w:hanging="360"/>
+      </w:pPr>
+    </w:lvl>
+    <w:lvl w:ilvl="4" w:tplc="0C090019" w:tentative="1">
+      <w:start w:val="1"/>
+      <w:numFmt w:val="lowerLetter"/>
+      <w:lvlText w:val="%5."/>
+      <w:lvlJc w:val="left"/>
+      <w:pPr>
+        <w:ind w:left="3600" w:hanging="360"/>
+      </w:pPr>
+    </w:lvl>
+    <w:lvl w:ilvl="5" w:tplc="0C09001B" w:tentative="1">
+      <w:start w:val="1"/>
+      <w:numFmt w:val="lowerRoman"/>
+      <w:lvlText w:val="%6."/>
+      <w:lvlJc w:val="right"/>
+      <w:pPr>
+        <w:ind w:left="4320" w:hanging="180"/>
+      </w:pPr>
+    </w:lvl>
+    <w:lvl w:ilvl="6" w:tplc="0C09000F" w:tentative="1">
+      <w:start w:val="1"/>
+      <w:numFmt w:val="decimal"/>
+      <w:lvlText w:val="%7."/>
+      <w:lvlJc w:val="left"/>
+      <w:pPr>
+        <w:ind w:left="5040" w:hanging="360"/>
+      </w:pPr>
+    </w:lvl>
+    <w:lvl w:ilvl="7" w:tplc="0C090019" w:tentative="1">
+      <w:start w:val="1"/>
+      <w:numFmt w:val="lowerLetter"/>
+      <w:lvlText w:val="%8."/>
+      <w:lvlJc w:val="left"/>
+      <w:pPr>
+        <w:ind w:left="5760" w:hanging="360"/>
+      </w:pPr>
+    </w:lvl>
+    <w:lvl w:ilvl="8" w:tplc="0C09001B" w:tentative="1">
+      <w:start w:val="1"/>
+      <w:numFmt w:val="lowerRoman"/>
+      <w:lvlText w:val="%9."/>
+      <w:lvlJc w:val="right"/>
+      <w:pPr>
+        <w:ind w:left="6480" w:hanging="180"/>
+      </w:pPr>
+    </w:lvl>
+  </w:abstractNum>
+  <w:abstractNum w:abstractNumId="4" w15:restartNumberingAfterBreak="0">
     <w:nsid w:val="5CE9324C"/>
     <w:multiLevelType w:val="hybridMultilevel"/>
     <w:tmpl w:val="40C66122"/>
@@ -3310,7 +4190,7 @@
       </w:pPr>
     </w:lvl>
   </w:abstractNum>
-  <w:abstractNum w:abstractNumId="3" w15:restartNumberingAfterBreak="0">
+  <w:abstractNum w:abstractNumId="5" w15:restartNumberingAfterBreak="0">
     <w:nsid w:val="5F661799"/>
     <w:multiLevelType w:val="hybridMultilevel"/>
     <w:tmpl w:val="E7508938"/>
@@ -3399,7 +4279,7 @@
       </w:pPr>
     </w:lvl>
   </w:abstractNum>
-  <w:abstractNum w:abstractNumId="4" w15:restartNumberingAfterBreak="0">
+  <w:abstractNum w:abstractNumId="6" w15:restartNumberingAfterBreak="0">
     <w:nsid w:val="6A7601E3"/>
     <w:multiLevelType w:val="hybridMultilevel"/>
     <w:tmpl w:val="01AC63EC"/>
@@ -3488,7 +4368,7 @@
       </w:pPr>
     </w:lvl>
   </w:abstractNum>
-  <w:abstractNum w:abstractNumId="5" w15:restartNumberingAfterBreak="0">
+  <w:abstractNum w:abstractNumId="7" w15:restartNumberingAfterBreak="0">
     <w:nsid w:val="79A50148"/>
     <w:multiLevelType w:val="hybridMultilevel"/>
     <w:tmpl w:val="53C88D98"/>
@@ -3601,22 +4481,28 @@
     </w:lvl>
   </w:abstractNum>
   <w:num w:numId="1" w16cid:durableId="1837181672">
-    <w:abstractNumId w:val="5"/>
+    <w:abstractNumId w:val="7"/>
   </w:num>
   <w:num w:numId="2" w16cid:durableId="1100415117">
     <w:abstractNumId w:val="0"/>
   </w:num>
   <w:num w:numId="3" w16cid:durableId="1241016076">
+    <w:abstractNumId w:val="6"/>
+  </w:num>
+  <w:num w:numId="4" w16cid:durableId="636879476">
+    <w:abstractNumId w:val="2"/>
+  </w:num>
+  <w:num w:numId="5" w16cid:durableId="759638401">
+    <w:abstractNumId w:val="5"/>
+  </w:num>
+  <w:num w:numId="6" w16cid:durableId="700663409">
     <w:abstractNumId w:val="4"/>
   </w:num>
-  <w:num w:numId="4" w16cid:durableId="636879476">
-    <w:abstractNumId w:val="1"/>
-  </w:num>
-  <w:num w:numId="5" w16cid:durableId="759638401">
+  <w:num w:numId="7" w16cid:durableId="1948610140">
     <w:abstractNumId w:val="3"/>
   </w:num>
-  <w:num w:numId="6" w16cid:durableId="700663409">
-    <w:abstractNumId w:val="2"/>
+  <w:num w:numId="8" w16cid:durableId="1299453553">
+    <w:abstractNumId w:val="1"/>
   </w:num>
 </w:numbering>
 </file>
@@ -4561,6 +5447,25 @@
       <w:szCs w:val="20"/>
     </w:rPr>
   </w:style>
+  <w:style w:type="paragraph" w:styleId="Caption">
+    <w:name w:val="caption"/>
+    <w:basedOn w:val="Normal"/>
+    <w:next w:val="Normal"/>
+    <w:uiPriority w:val="35"/>
+    <w:unhideWhenUsed/>
+    <w:qFormat/>
+    <w:rsid w:val="00544D3F"/>
+    <w:pPr>
+      <w:spacing w:after="200" w:line="240" w:lineRule="auto"/>
+    </w:pPr>
+    <w:rPr>
+      <w:i/>
+      <w:iCs/>
+      <w:color w:val="0E2841" w:themeColor="text2"/>
+      <w:sz w:val="18"/>
+      <w:szCs w:val="18"/>
+    </w:rPr>
+  </w:style>
 </w:styles>
 </file>
 

</xml_diff>